<commit_message>
Update documentation of pyB12logger
</commit_message>
<xml_diff>
--- a/manual/Spectrometer Logger Manual.docx
+++ b/manual/Spectrometer Logger Manual.docx
@@ -1,6 +1,6 @@
 
 <file path=word/document.xml><?xml version="1.0" encoding="utf-8"?>
-<w:document xmlns:wpc="http://schemas.microsoft.com/office/word/2010/wordprocessingCanvas" xmlns:cx="http://schemas.microsoft.com/office/drawing/2014/chartex" xmlns:cx1="http://schemas.microsoft.com/office/drawing/2015/9/8/chartex" xmlns:cx2="http://schemas.microsoft.com/office/drawing/2015/10/21/chartex" xmlns:cx3="http://schemas.microsoft.com/office/drawing/2016/5/9/chartex" xmlns:cx4="http://schemas.microsoft.com/office/drawing/2016/5/10/chartex" xmlns:cx5="http://schemas.microsoft.com/office/drawing/2016/5/11/chartex" xmlns:cx6="http://schemas.microsoft.com/office/drawing/2016/5/12/chartex" xmlns:cx7="http://schemas.microsoft.com/office/drawing/2016/5/13/chartex" xmlns:cx8="http://schemas.microsoft.com/office/drawing/2016/5/14/chartex" xmlns:mc="http://schemas.openxmlformats.org/markup-compatibility/2006" xmlns:aink="http://schemas.microsoft.com/office/drawing/2016/ink" xmlns:am3d="http://schemas.microsoft.com/office/drawing/2017/model3d" xmlns:o="urn:schemas-microsoft-com:office:office" xmlns:oel="http://schemas.microsoft.com/office/2019/extlst" xmlns:r="http://schemas.openxmlformats.org/officeDocument/2006/relationships" xmlns:m="http://schemas.openxmlformats.org/officeDocument/2006/math" xmlns:v="urn:schemas-microsoft-com:vml" xmlns:wp14="http://schemas.microsoft.com/office/word/2010/wordprocessingDrawing" xmlns:wp="http://schemas.openxmlformats.org/drawingml/2006/wordprocessingDrawing" xmlns:w10="urn:schemas-microsoft-com:office:word" xmlns:w="http://schemas.openxmlformats.org/wordprocessingml/2006/main" xmlns:w14="http://schemas.microsoft.com/office/word/2010/wordml" xmlns:w15="http://schemas.microsoft.com/office/word/2012/wordml" xmlns:w16cex="http://schemas.microsoft.com/office/word/2018/wordml/cex" xmlns:w16cid="http://schemas.microsoft.com/office/word/2016/wordml/cid" xmlns:w16="http://schemas.microsoft.com/office/word/2018/wordml" xmlns:w16sdtdh="http://schemas.microsoft.com/office/word/2020/wordml/sdtdatahash" xmlns:w16se="http://schemas.microsoft.com/office/word/2015/wordml/symex" xmlns:wpg="http://schemas.microsoft.com/office/word/2010/wordprocessingGroup" xmlns:wpi="http://schemas.microsoft.com/office/word/2010/wordprocessingInk" xmlns:wne="http://schemas.microsoft.com/office/word/2006/wordml" xmlns:wps="http://schemas.microsoft.com/office/word/2010/wordprocessingShape" mc:Ignorable="w14 w15 w16se w16cid w16 w16cex w16sdtdh wp14">
+<w:document xmlns:wpc="http://schemas.microsoft.com/office/word/2010/wordprocessingCanvas" xmlns:cx="http://schemas.microsoft.com/office/drawing/2014/chartex" xmlns:cx1="http://schemas.microsoft.com/office/drawing/2015/9/8/chartex" xmlns:cx2="http://schemas.microsoft.com/office/drawing/2015/10/21/chartex" xmlns:cx3="http://schemas.microsoft.com/office/drawing/2016/5/9/chartex" xmlns:cx4="http://schemas.microsoft.com/office/drawing/2016/5/10/chartex" xmlns:cx5="http://schemas.microsoft.com/office/drawing/2016/5/11/chartex" xmlns:cx6="http://schemas.microsoft.com/office/drawing/2016/5/12/chartex" xmlns:cx7="http://schemas.microsoft.com/office/drawing/2016/5/13/chartex" xmlns:cx8="http://schemas.microsoft.com/office/drawing/2016/5/14/chartex" xmlns:mc="http://schemas.openxmlformats.org/markup-compatibility/2006" xmlns:aink="http://schemas.microsoft.com/office/drawing/2016/ink" xmlns:am3d="http://schemas.microsoft.com/office/drawing/2017/model3d" xmlns:o="urn:schemas-microsoft-com:office:office" xmlns:oel="http://schemas.microsoft.com/office/2019/extlst" xmlns:r="http://schemas.openxmlformats.org/officeDocument/2006/relationships" xmlns:m="http://schemas.openxmlformats.org/officeDocument/2006/math" xmlns:v="urn:schemas-microsoft-com:vml" xmlns:wp14="http://schemas.microsoft.com/office/word/2010/wordprocessingDrawing" xmlns:wp="http://schemas.openxmlformats.org/drawingml/2006/wordprocessingDrawing" xmlns:w10="urn:schemas-microsoft-com:office:word" xmlns:w="http://schemas.openxmlformats.org/wordprocessingml/2006/main" xmlns:w14="http://schemas.microsoft.com/office/word/2010/wordml" xmlns:w15="http://schemas.microsoft.com/office/word/2012/wordml" xmlns:w16cex="http://schemas.microsoft.com/office/word/2018/wordml/cex" xmlns:w16cid="http://schemas.microsoft.com/office/word/2016/wordml/cid" xmlns:w16="http://schemas.microsoft.com/office/word/2018/wordml" xmlns:w16du="http://schemas.microsoft.com/office/word/2023/wordml/word16du" xmlns:w16sdtdh="http://schemas.microsoft.com/office/word/2020/wordml/sdtdatahash" xmlns:w16se="http://schemas.microsoft.com/office/word/2015/wordml/symex" xmlns:wpg="http://schemas.microsoft.com/office/word/2010/wordprocessingGroup" xmlns:wpi="http://schemas.microsoft.com/office/word/2010/wordprocessingInk" xmlns:wne="http://schemas.microsoft.com/office/word/2006/wordml" xmlns:wps="http://schemas.microsoft.com/office/word/2010/wordprocessingShape" mc:Ignorable="w14 w15 w16se w16cid w16 w16cex w16sdtdh w16du wp14">
   <w:body>
     <w:p>
       <w:pPr>
@@ -24,7 +24,10 @@
     </w:p>
     <w:p>
       <w:r>
-        <w:t>Date: 02/06/2024</w:t>
+        <w:t xml:space="preserve">Date: </w:t>
+      </w:r>
+      <w:r>
+        <w:t>06/24/2024</w:t>
       </w:r>
     </w:p>
     <w:p>
@@ -52,6 +55,7 @@
     </w:p>
     <w:p>
       <w:pPr>
+        <w:ind w:firstLine="0"/>
         <w:jc w:val="left"/>
       </w:pPr>
     </w:p>
@@ -81,7 +85,7 @@
         <w:t>Minimum Version: Python 3.</w:t>
       </w:r>
       <w:r>
-        <w:t>6</w:t>
+        <w:t>11</w:t>
       </w:r>
       <w:r>
         <w:t xml:space="preserve"> </w:t>
@@ -97,86 +101,150 @@
       </w:r>
     </w:p>
     <w:p>
-      <w:pPr>
-        <w:pStyle w:val="Heading2"/>
-      </w:pPr>
-      <w:r>
-        <w:t>Download from GitHub</w:t>
-      </w:r>
-    </w:p>
-    <w:p>
+      <w:r>
+        <w:t xml:space="preserve">Download logger program from the </w:t>
+      </w:r>
       <w:hyperlink r:id="rId8" w:history="1">
         <w:r>
           <w:rPr>
             <w:rStyle w:val="Hyperlink"/>
           </w:rPr>
-          <w:t>https://github.com/Bridge12Technologies/pyB12LOG</w:t>
+          <w:t>link</w:t>
         </w:r>
       </w:hyperlink>
-    </w:p>
-    <w:p/>
-    <w:p>
-      <w:r>
-        <w:t>After downloading, type the command in terminal window:</w:t>
+      <w:r>
+        <w:t>. In the terminal, change the directory to the folder where the pyB12logger is. Then type in ‘</w:t>
+      </w:r>
+      <w:r>
+        <w:t>pip install -e pyB12LOG</w:t>
+      </w:r>
+      <w:r>
+        <w:t xml:space="preserve">’. </w:t>
       </w:r>
     </w:p>
     <w:p>
-      <w:r>
-        <w:t>pip install -e pyB12LOG</w:t>
-      </w:r>
+      <w:pPr>
+        <w:ind w:firstLine="0"/>
+      </w:pPr>
     </w:p>
     <w:p>
       <w:pPr>
+        <w:pStyle w:val="Heading1"/>
         <w:ind w:firstLine="0"/>
       </w:pPr>
+      <w:r>
+        <w:t>General Usage</w:t>
+      </w:r>
+      <w:r>
+        <w:t xml:space="preserve"> of pyB12logger</w:t>
+      </w:r>
     </w:p>
     <w:p>
       <w:pPr>
-        <w:pStyle w:val="Heading2"/>
-      </w:pPr>
-      <w:r>
-        <w:t>Pip Install</w:t>
+        <w:ind w:firstLine="0"/>
+      </w:pPr>
+      <w:r>
+        <w:t xml:space="preserve">The pyB12logger is used to log data/status from instruments. When first start the logger, some configuration files and log folders will be created automatically. </w:t>
       </w:r>
     </w:p>
     <w:p>
-      <w:r>
-        <w:t>Pip install pyB12LOG</w:t>
-      </w:r>
-    </w:p>
-    <w:p/>
-    <w:p>
-      <w:pPr>
-        <w:pStyle w:val="Heading1"/>
+      <w:pPr>
         <w:ind w:firstLine="0"/>
       </w:pPr>
-      <w:r>
-        <w:t>General Usage</w:t>
-      </w:r>
-      <w:r>
-        <w:t xml:space="preserve"> of pyB12logger</w:t>
-      </w:r>
     </w:p>
     <w:p>
-      <w:r>
-        <w:t>The pyB12logger is used to log data/status from instruments. When first start the logger, some configuration files and log folders will be created automatically. To start or control the logger, type the following command in terminal window</w:t>
-      </w:r>
-      <w:r>
-        <w:t>. Please be advised that the options of startup and desktop are only available in the administration mode.</w:t>
-      </w:r>
-    </w:p>
-    <w:p/>
-    <w:p>
       <w:pPr>
         <w:ind w:firstLine="0"/>
       </w:pPr>
       <w:r>
-        <w:t>pyB12logger [-h] [-desktop {True,False}] [-startup {True,False}] [-debug {True,False}] [{start,stop}]</w:t>
+        <w:t xml:space="preserve">To start the logger, type </w:t>
+      </w:r>
+      <w:r>
+        <w:t xml:space="preserve">in </w:t>
+      </w:r>
+      <w:r>
+        <w:t>the</w:t>
+      </w:r>
+      <w:r>
+        <w:t xml:space="preserve"> ‘</w:t>
+      </w:r>
+      <w:r>
+        <w:rPr>
+          <w:b/>
+          <w:bCs/>
+        </w:rPr>
+        <w:t>pyB12logger</w:t>
+      </w:r>
+      <w:r>
+        <w:t>’</w:t>
+      </w:r>
+      <w:r>
+        <w:t xml:space="preserve"> terminal window</w:t>
+      </w:r>
+      <w:r>
+        <w:t xml:space="preserve">. </w:t>
+      </w:r>
+      <w:r>
+        <w:t xml:space="preserve">You </w:t>
+      </w:r>
+      <w:r>
+        <w:t>are allowed to</w:t>
+      </w:r>
+      <w:r>
+        <w:t xml:space="preserve"> start only one pyB12logger.</w:t>
       </w:r>
     </w:p>
     <w:p>
       <w:pPr>
         <w:ind w:firstLine="0"/>
       </w:pPr>
+    </w:p>
+    <w:p>
+      <w:pPr>
+        <w:ind w:firstLine="0"/>
+      </w:pPr>
+      <w:r>
+        <w:t xml:space="preserve">To stop the logger, </w:t>
+      </w:r>
+      <w:r>
+        <w:t>type in the ‘</w:t>
+      </w:r>
+      <w:r>
+        <w:rPr>
+          <w:b/>
+          <w:bCs/>
+        </w:rPr>
+        <w:t>pyB12logger</w:t>
+      </w:r>
+      <w:r>
+        <w:rPr>
+          <w:b/>
+          <w:bCs/>
+        </w:rPr>
+        <w:t xml:space="preserve"> stop</w:t>
+      </w:r>
+      <w:r>
+        <w:t>’ terminal window.</w:t>
+      </w:r>
+      <w:r>
+        <w:t xml:space="preserve"> </w:t>
+      </w:r>
+    </w:p>
+    <w:p>
+      <w:pPr>
+        <w:ind w:firstLine="0"/>
+      </w:pPr>
+    </w:p>
+    <w:p>
+      <w:pPr>
+        <w:ind w:firstLine="0"/>
+      </w:pPr>
+      <w:r>
+        <w:t xml:space="preserve">There are some arguments that can be passed through pyB12logger. The arguments are stated in the below table. </w:t>
+      </w:r>
+      <w:r>
+        <w:t>Please be advised that the options of startup and desktop are only available in the administration mode.</w:t>
+      </w:r>
     </w:p>
     <w:tbl>
       <w:tblPr>
@@ -198,6 +266,7 @@
               <w:ind w:firstLine="0"/>
             </w:pPr>
             <w:r>
+              <w:lastRenderedPageBreak/>
               <w:t>Arguments/Options</w:t>
             </w:r>
           </w:p>
@@ -401,7 +470,6 @@
         <w:rPr>
           <w:noProof/>
         </w:rPr>
-        <w:lastRenderedPageBreak/>
         <w:drawing>
           <wp:inline distT="0" distB="0" distL="0" distR="0" wp14:anchorId="53124666" wp14:editId="36025F3A">
             <wp:extent cx="5486400" cy="2984500"/>
@@ -460,6 +528,7 @@
         <w:ind w:firstLine="0"/>
       </w:pPr>
       <w:r>
+        <w:lastRenderedPageBreak/>
         <w:t>Logger Configuration</w:t>
       </w:r>
     </w:p>
@@ -486,105 +555,1355 @@
         <w:t xml:space="preserve">g/config.cfg. </w:t>
       </w:r>
       <w:r>
-        <w:t>A user can modify the configuration and add devices configuration in the following example format.</w:t>
+        <w:t xml:space="preserve">A user can modify </w:t>
+      </w:r>
+      <w:r>
+        <w:t xml:space="preserve">or add </w:t>
+      </w:r>
+      <w:r>
+        <w:t>configuration</w:t>
+      </w:r>
+      <w:r>
+        <w:t xml:space="preserve"> </w:t>
+      </w:r>
+      <w:r>
+        <w:t xml:space="preserve">to match the following </w:t>
+      </w:r>
+      <w:r>
+        <w:t>format.</w:t>
       </w:r>
     </w:p>
     <w:p>
       <w:pPr>
         <w:jc w:val="left"/>
-      </w:pPr>
-      <w:r>
         <w:rPr>
-          <w:noProof/>
+          <w:b/>
+          <w:bCs/>
         </w:rPr>
-        <w:drawing>
-          <wp:inline distT="0" distB="0" distL="0" distR="0" wp14:anchorId="52ED5159" wp14:editId="51056392">
-            <wp:extent cx="5486400" cy="2334260"/>
-            <wp:effectExtent l="0" t="0" r="0" b="8890"/>
-            <wp:docPr id="35871627" name="Picture 3" descr="A screenshot of a computer program&#10;&#10;Description automatically generated"/>
-            <wp:cNvGraphicFramePr>
-              <a:graphicFrameLocks xmlns:a="http://schemas.openxmlformats.org/drawingml/2006/main" noChangeAspect="1"/>
-            </wp:cNvGraphicFramePr>
-            <a:graphic xmlns:a="http://schemas.openxmlformats.org/drawingml/2006/main">
-              <a:graphicData uri="http://schemas.openxmlformats.org/drawingml/2006/picture">
-                <pic:pic xmlns:pic="http://schemas.openxmlformats.org/drawingml/2006/picture">
-                  <pic:nvPicPr>
-                    <pic:cNvPr id="35871627" name="Picture 3" descr="A screenshot of a computer program&#10;&#10;Description automatically generated"/>
-                    <pic:cNvPicPr/>
-                  </pic:nvPicPr>
-                  <pic:blipFill>
-                    <a:blip r:embed="rId10"/>
-                    <a:stretch>
-                      <a:fillRect/>
-                    </a:stretch>
-                  </pic:blipFill>
-                  <pic:spPr>
-                    <a:xfrm>
-                      <a:off x="0" y="0"/>
-                      <a:ext cx="5486400" cy="2334260"/>
-                    </a:xfrm>
-                    <a:prstGeom prst="rect">
-                      <a:avLst/>
-                    </a:prstGeom>
-                  </pic:spPr>
-                </pic:pic>
-              </a:graphicData>
-            </a:graphic>
-          </wp:inline>
-        </w:drawing>
+      </w:pPr>
+      <w:r>
+        <w:rPr>
+          <w:b/>
+          <w:bCs/>
+        </w:rPr>
+        <w:t>[</w:t>
+      </w:r>
+      <w:proofErr w:type="spellStart"/>
+      <w:r>
+        <w:rPr>
+          <w:b/>
+          <w:bCs/>
+        </w:rPr>
+        <w:t>name_of_device</w:t>
+      </w:r>
+      <w:proofErr w:type="spellEnd"/>
+      <w:r>
+        <w:rPr>
+          <w:b/>
+          <w:bCs/>
+        </w:rPr>
+        <w:t>]</w:t>
       </w:r>
     </w:p>
     <w:p>
       <w:pPr>
         <w:jc w:val="left"/>
-      </w:pPr>
+        <w:rPr>
+          <w:b/>
+          <w:bCs/>
+        </w:rPr>
+      </w:pPr>
+      <w:proofErr w:type="spellStart"/>
+      <w:r>
+        <w:rPr>
+          <w:b/>
+          <w:bCs/>
+        </w:rPr>
+        <w:t>configuration_key</w:t>
+      </w:r>
+      <w:proofErr w:type="spellEnd"/>
+      <w:r>
+        <w:rPr>
+          <w:b/>
+          <w:bCs/>
+        </w:rPr>
+        <w:t xml:space="preserve"> = value</w:t>
+      </w:r>
     </w:p>
     <w:p>
       <w:pPr>
-        <w:ind w:firstLine="0"/>
         <w:jc w:val="left"/>
-      </w:pPr>
-      <w:r>
-        <w:t xml:space="preserve">In the command area, the logger will send the commands (e.g. command1 &amp; command2) to devices, analyze return string and assign the analyzed data to </w:t>
-      </w:r>
-      <w:r>
-        <w:lastRenderedPageBreak/>
-        <w:t xml:space="preserve">the variables (e.g. </w:t>
-      </w:r>
-      <w:r>
-        <w:t>variable 1 &amp; variable 2</w:t>
-      </w:r>
-      <w:r>
-        <w:t>). In logger and in monitor, variables are used as headers for saving and reading, respectively.</w:t>
+        <w:rPr>
+          <w:b/>
+          <w:bCs/>
+        </w:rPr>
+      </w:pPr>
+      <w:r>
+        <w:rPr>
+          <w:b/>
+          <w:bCs/>
+        </w:rPr>
+        <w:t>…</w:t>
       </w:r>
     </w:p>
     <w:p>
       <w:pPr>
-        <w:ind w:firstLine="0"/>
         <w:jc w:val="left"/>
-      </w:pPr>
+        <w:rPr>
+          <w:b/>
+          <w:bCs/>
+        </w:rPr>
+      </w:pPr>
+      <w:r>
+        <w:rPr>
+          <w:b/>
+          <w:bCs/>
+        </w:rPr>
+        <w:t>variable1 = command1, alias = var1, ….</w:t>
+      </w:r>
     </w:p>
     <w:p>
       <w:pPr>
-        <w:ind w:firstLine="0"/>
         <w:jc w:val="left"/>
-      </w:pPr>
-      <w:r>
-        <w:t>The alias is the user defined name to identify the data curve in monitor. The rest three elements (min, max, static) are used for warning indicting in the monitor. All these four elements are not required.</w:t>
+        <w:rPr>
+          <w:b/>
+          <w:bCs/>
+        </w:rPr>
+      </w:pPr>
+      <w:r>
+        <w:rPr>
+          <w:b/>
+          <w:bCs/>
+        </w:rPr>
+        <w:t>V</w:t>
+      </w:r>
+      <w:r>
+        <w:rPr>
+          <w:b/>
+          <w:bCs/>
+        </w:rPr>
+        <w:t>ariable</w:t>
+      </w:r>
+      <w:r>
+        <w:rPr>
+          <w:b/>
+          <w:bCs/>
+        </w:rPr>
+        <w:t>2</w:t>
+      </w:r>
+      <w:r>
+        <w:rPr>
+          <w:b/>
+          <w:bCs/>
+        </w:rPr>
+        <w:t xml:space="preserve"> = command</w:t>
+      </w:r>
+      <w:r>
+        <w:rPr>
+          <w:b/>
+          <w:bCs/>
+        </w:rPr>
+        <w:t xml:space="preserve">2, </w:t>
+      </w:r>
+      <w:r>
+        <w:rPr>
+          <w:b/>
+          <w:bCs/>
+        </w:rPr>
+        <w:t>alias = var</w:t>
+      </w:r>
+      <w:r>
+        <w:rPr>
+          <w:b/>
+          <w:bCs/>
+        </w:rPr>
+        <w:t>2</w:t>
+      </w:r>
+      <w:r>
+        <w:rPr>
+          <w:b/>
+          <w:bCs/>
+        </w:rPr>
+        <w:t>, ….</w:t>
       </w:r>
     </w:p>
     <w:p>
       <w:pPr>
-        <w:ind w:firstLine="0"/>
         <w:jc w:val="left"/>
       </w:pPr>
+      <w:r>
+        <w:t>The first part of the format is for device connection. The device configuration keys and value are shown below. Only ‘</w:t>
+      </w:r>
+      <w:proofErr w:type="spellStart"/>
+      <w:r>
+        <w:t>device_status</w:t>
+      </w:r>
+      <w:proofErr w:type="spellEnd"/>
+      <w:r>
+        <w:t>’ and ‘address’ are necessary to be provided.</w:t>
+      </w:r>
+      <w:r>
+        <w:t xml:space="preserve"> </w:t>
+      </w:r>
+      <w:r>
+        <w:t>If a configuration key is not provided, a default value will be set for the key.</w:t>
+      </w:r>
+      <w:r>
+        <w:t xml:space="preserve"> DO NOT use quote mark for any of the following values. The logger handles the value type internally.</w:t>
+      </w:r>
+    </w:p>
+    <w:tbl>
+      <w:tblPr>
+        <w:tblStyle w:val="TableGrid"/>
+        <w:tblW w:w="5000" w:type="pct"/>
+        <w:tblLook w:val="04A0" w:firstRow="1" w:lastRow="0" w:firstColumn="1" w:lastColumn="0" w:noHBand="0" w:noVBand="1"/>
+      </w:tblPr>
+      <w:tblGrid>
+        <w:gridCol w:w="1982"/>
+        <w:gridCol w:w="1384"/>
+        <w:gridCol w:w="5264"/>
+      </w:tblGrid>
+      <w:tr>
+        <w:tc>
+          <w:tcPr>
+            <w:tcW w:w="1148" w:type="pct"/>
+          </w:tcPr>
+          <w:p>
+            <w:pPr>
+              <w:ind w:firstLine="0"/>
+              <w:jc w:val="center"/>
+            </w:pPr>
+            <w:r>
+              <w:t>Configuration Key</w:t>
+            </w:r>
+          </w:p>
+        </w:tc>
+        <w:tc>
+          <w:tcPr>
+            <w:tcW w:w="802" w:type="pct"/>
+          </w:tcPr>
+          <w:p>
+            <w:pPr>
+              <w:ind w:firstLine="0"/>
+              <w:jc w:val="center"/>
+            </w:pPr>
+            <w:r>
+              <w:t>Default Value</w:t>
+            </w:r>
+          </w:p>
+        </w:tc>
+        <w:tc>
+          <w:tcPr>
+            <w:tcW w:w="3050" w:type="pct"/>
+          </w:tcPr>
+          <w:p>
+            <w:pPr>
+              <w:ind w:firstLine="0"/>
+              <w:jc w:val="center"/>
+            </w:pPr>
+            <w:r>
+              <w:t>Comments</w:t>
+            </w:r>
+          </w:p>
+        </w:tc>
+      </w:tr>
+      <w:tr>
+        <w:tc>
+          <w:tcPr>
+            <w:tcW w:w="1148" w:type="pct"/>
+          </w:tcPr>
+          <w:p>
+            <w:pPr>
+              <w:ind w:firstLine="0"/>
+              <w:jc w:val="center"/>
+            </w:pPr>
+            <w:proofErr w:type="spellStart"/>
+            <w:r>
+              <w:t>device_status</w:t>
+            </w:r>
+            <w:proofErr w:type="spellEnd"/>
+          </w:p>
+        </w:tc>
+        <w:tc>
+          <w:tcPr>
+            <w:tcW w:w="802" w:type="pct"/>
+          </w:tcPr>
+          <w:p>
+            <w:pPr>
+              <w:ind w:firstLine="0"/>
+              <w:jc w:val="center"/>
+            </w:pPr>
+            <w:r>
+              <w:t>False</w:t>
+            </w:r>
+          </w:p>
+        </w:tc>
+        <w:tc>
+          <w:tcPr>
+            <w:tcW w:w="3050" w:type="pct"/>
+          </w:tcPr>
+          <w:p>
+            <w:pPr>
+              <w:ind w:firstLine="0"/>
+              <w:jc w:val="left"/>
+            </w:pPr>
+            <w:r>
+              <w:t>If True, the logger will try to build connection with this device.</w:t>
+            </w:r>
+          </w:p>
+        </w:tc>
+      </w:tr>
+      <w:tr>
+        <w:tc>
+          <w:tcPr>
+            <w:tcW w:w="1148" w:type="pct"/>
+          </w:tcPr>
+          <w:p>
+            <w:pPr>
+              <w:ind w:firstLine="0"/>
+              <w:jc w:val="center"/>
+            </w:pPr>
+            <w:r>
+              <w:t>address</w:t>
+            </w:r>
+          </w:p>
+        </w:tc>
+        <w:tc>
+          <w:tcPr>
+            <w:tcW w:w="802" w:type="pct"/>
+          </w:tcPr>
+          <w:p>
+            <w:pPr>
+              <w:ind w:firstLine="0"/>
+              <w:jc w:val="center"/>
+            </w:pPr>
+            <w:r>
+              <w:t>None</w:t>
+            </w:r>
+          </w:p>
+        </w:tc>
+        <w:tc>
+          <w:tcPr>
+            <w:tcW w:w="3050" w:type="pct"/>
+          </w:tcPr>
+          <w:p>
+            <w:pPr>
+              <w:ind w:firstLine="0"/>
+              <w:jc w:val="left"/>
+            </w:pPr>
+            <w:r>
+              <w:t xml:space="preserve">The </w:t>
+            </w:r>
+            <w:proofErr w:type="spellStart"/>
+            <w:r>
+              <w:t>pyVisa</w:t>
+            </w:r>
+            <w:proofErr w:type="spellEnd"/>
+            <w:r>
+              <w:t xml:space="preserve"> address of a device</w:t>
+            </w:r>
+            <w:r>
+              <w:t xml:space="preserve"> </w:t>
+            </w:r>
+          </w:p>
+        </w:tc>
+      </w:tr>
+      <w:tr>
+        <w:tc>
+          <w:tcPr>
+            <w:tcW w:w="1148" w:type="pct"/>
+          </w:tcPr>
+          <w:p>
+            <w:pPr>
+              <w:ind w:firstLine="0"/>
+              <w:jc w:val="center"/>
+            </w:pPr>
+            <w:proofErr w:type="spellStart"/>
+            <w:r>
+              <w:t>id_command</w:t>
+            </w:r>
+            <w:proofErr w:type="spellEnd"/>
+          </w:p>
+        </w:tc>
+        <w:tc>
+          <w:tcPr>
+            <w:tcW w:w="802" w:type="pct"/>
+          </w:tcPr>
+          <w:p>
+            <w:pPr>
+              <w:ind w:firstLine="0"/>
+              <w:jc w:val="center"/>
+            </w:pPr>
+            <w:r>
+              <w:t>*IDN?</w:t>
+            </w:r>
+          </w:p>
+        </w:tc>
+        <w:tc>
+          <w:tcPr>
+            <w:tcW w:w="3050" w:type="pct"/>
+          </w:tcPr>
+          <w:p>
+            <w:pPr>
+              <w:ind w:firstLine="0"/>
+              <w:jc w:val="left"/>
+            </w:pPr>
+            <w:r>
+              <w:t>The command to check connection</w:t>
+            </w:r>
+            <w:r>
+              <w:t xml:space="preserve"> (String)</w:t>
+            </w:r>
+          </w:p>
+        </w:tc>
+      </w:tr>
+      <w:tr>
+        <w:tc>
+          <w:tcPr>
+            <w:tcW w:w="1148" w:type="pct"/>
+          </w:tcPr>
+          <w:p>
+            <w:pPr>
+              <w:ind w:firstLine="0"/>
+              <w:jc w:val="center"/>
+            </w:pPr>
+            <w:proofErr w:type="spellStart"/>
+            <w:r>
+              <w:t>baud_rate</w:t>
+            </w:r>
+            <w:proofErr w:type="spellEnd"/>
+          </w:p>
+        </w:tc>
+        <w:tc>
+          <w:tcPr>
+            <w:tcW w:w="802" w:type="pct"/>
+          </w:tcPr>
+          <w:p>
+            <w:pPr>
+              <w:ind w:firstLine="0"/>
+              <w:jc w:val="center"/>
+            </w:pPr>
+            <w:r>
+              <w:t>9600</w:t>
+            </w:r>
+          </w:p>
+        </w:tc>
+        <w:tc>
+          <w:tcPr>
+            <w:tcW w:w="3050" w:type="pct"/>
+          </w:tcPr>
+          <w:p>
+            <w:pPr>
+              <w:ind w:firstLine="0"/>
+              <w:jc w:val="left"/>
+            </w:pPr>
+            <w:r>
+              <w:t>The baud rate for connection</w:t>
+            </w:r>
+            <w:r>
+              <w:t xml:space="preserve"> </w:t>
+            </w:r>
+          </w:p>
+        </w:tc>
+      </w:tr>
+      <w:tr>
+        <w:tc>
+          <w:tcPr>
+            <w:tcW w:w="1148" w:type="pct"/>
+          </w:tcPr>
+          <w:p>
+            <w:pPr>
+              <w:ind w:firstLine="0"/>
+              <w:jc w:val="center"/>
+            </w:pPr>
+            <w:r>
+              <w:t>termination</w:t>
+            </w:r>
+          </w:p>
+        </w:tc>
+        <w:tc>
+          <w:tcPr>
+            <w:tcW w:w="802" w:type="pct"/>
+          </w:tcPr>
+          <w:p>
+            <w:pPr>
+              <w:ind w:firstLine="0"/>
+              <w:jc w:val="center"/>
+            </w:pPr>
+            <w:r>
+              <w:t>\n</w:t>
+            </w:r>
+          </w:p>
+        </w:tc>
+        <w:tc>
+          <w:tcPr>
+            <w:tcW w:w="3050" w:type="pct"/>
+          </w:tcPr>
+          <w:p>
+            <w:pPr>
+              <w:ind w:firstLine="0"/>
+              <w:jc w:val="left"/>
+            </w:pPr>
+            <w:r>
+              <w:t>The terminations for both read and write</w:t>
+            </w:r>
+            <w:r>
+              <w:t xml:space="preserve"> </w:t>
+            </w:r>
+          </w:p>
+        </w:tc>
+      </w:tr>
+      <w:tr>
+        <w:tc>
+          <w:tcPr>
+            <w:tcW w:w="1148" w:type="pct"/>
+          </w:tcPr>
+          <w:p>
+            <w:pPr>
+              <w:ind w:firstLine="0"/>
+              <w:jc w:val="center"/>
+            </w:pPr>
+            <w:proofErr w:type="spellStart"/>
+            <w:r>
+              <w:t>data_bits</w:t>
+            </w:r>
+            <w:proofErr w:type="spellEnd"/>
+          </w:p>
+        </w:tc>
+        <w:tc>
+          <w:tcPr>
+            <w:tcW w:w="802" w:type="pct"/>
+          </w:tcPr>
+          <w:p>
+            <w:pPr>
+              <w:ind w:firstLine="0"/>
+              <w:jc w:val="center"/>
+            </w:pPr>
+            <w:r>
+              <w:t>8</w:t>
+            </w:r>
+          </w:p>
+        </w:tc>
+        <w:tc>
+          <w:tcPr>
+            <w:tcW w:w="3050" w:type="pct"/>
+          </w:tcPr>
+          <w:p>
+            <w:pPr>
+              <w:ind w:firstLine="0"/>
+              <w:jc w:val="left"/>
+            </w:pPr>
+            <w:r>
+              <w:t xml:space="preserve">The data bit for connection </w:t>
+            </w:r>
+          </w:p>
+        </w:tc>
+      </w:tr>
+      <w:tr>
+        <w:tc>
+          <w:tcPr>
+            <w:tcW w:w="1148" w:type="pct"/>
+          </w:tcPr>
+          <w:p>
+            <w:pPr>
+              <w:ind w:firstLine="0"/>
+              <w:jc w:val="center"/>
+            </w:pPr>
+            <w:proofErr w:type="spellStart"/>
+            <w:r>
+              <w:t>flow_control</w:t>
+            </w:r>
+            <w:proofErr w:type="spellEnd"/>
+          </w:p>
+        </w:tc>
+        <w:tc>
+          <w:tcPr>
+            <w:tcW w:w="802" w:type="pct"/>
+          </w:tcPr>
+          <w:p>
+            <w:pPr>
+              <w:ind w:firstLine="0"/>
+              <w:jc w:val="center"/>
+            </w:pPr>
+            <w:r>
+              <w:t>None</w:t>
+            </w:r>
+          </w:p>
+        </w:tc>
+        <w:tc>
+          <w:tcPr>
+            <w:tcW w:w="3050" w:type="pct"/>
+          </w:tcPr>
+          <w:p>
+            <w:pPr>
+              <w:ind w:firstLine="0"/>
+              <w:jc w:val="left"/>
+            </w:pPr>
+            <w:r>
+              <w:t>The flow control for connection</w:t>
+            </w:r>
+          </w:p>
+        </w:tc>
+      </w:tr>
+      <w:tr>
+        <w:tc>
+          <w:tcPr>
+            <w:tcW w:w="1148" w:type="pct"/>
+          </w:tcPr>
+          <w:p>
+            <w:pPr>
+              <w:ind w:firstLine="0"/>
+              <w:jc w:val="center"/>
+            </w:pPr>
+            <w:r>
+              <w:t>parity</w:t>
+            </w:r>
+          </w:p>
+        </w:tc>
+        <w:tc>
+          <w:tcPr>
+            <w:tcW w:w="802" w:type="pct"/>
+          </w:tcPr>
+          <w:p>
+            <w:pPr>
+              <w:ind w:firstLine="0"/>
+              <w:jc w:val="center"/>
+            </w:pPr>
+            <w:r>
+              <w:t>None</w:t>
+            </w:r>
+          </w:p>
+        </w:tc>
+        <w:tc>
+          <w:tcPr>
+            <w:tcW w:w="3050" w:type="pct"/>
+          </w:tcPr>
+          <w:p>
+            <w:pPr>
+              <w:ind w:firstLine="0"/>
+              <w:jc w:val="left"/>
+            </w:pPr>
+            <w:r>
+              <w:t>The parity for connection</w:t>
+            </w:r>
+          </w:p>
+        </w:tc>
+      </w:tr>
+      <w:tr>
+        <w:tc>
+          <w:tcPr>
+            <w:tcW w:w="1148" w:type="pct"/>
+          </w:tcPr>
+          <w:p>
+            <w:pPr>
+              <w:ind w:firstLine="0"/>
+              <w:jc w:val="center"/>
+            </w:pPr>
+            <w:proofErr w:type="spellStart"/>
+            <w:r>
+              <w:t>stop_bits</w:t>
+            </w:r>
+            <w:proofErr w:type="spellEnd"/>
+          </w:p>
+        </w:tc>
+        <w:tc>
+          <w:tcPr>
+            <w:tcW w:w="802" w:type="pct"/>
+          </w:tcPr>
+          <w:p>
+            <w:pPr>
+              <w:ind w:firstLine="0"/>
+              <w:jc w:val="center"/>
+            </w:pPr>
+            <w:r>
+              <w:t>None</w:t>
+            </w:r>
+          </w:p>
+        </w:tc>
+        <w:tc>
+          <w:tcPr>
+            <w:tcW w:w="3050" w:type="pct"/>
+          </w:tcPr>
+          <w:p>
+            <w:pPr>
+              <w:ind w:firstLine="0"/>
+              <w:jc w:val="left"/>
+            </w:pPr>
+            <w:r>
+              <w:t xml:space="preserve">The </w:t>
+            </w:r>
+            <w:r>
+              <w:t>stop bits</w:t>
+            </w:r>
+            <w:r>
+              <w:t xml:space="preserve"> for connection</w:t>
+            </w:r>
+          </w:p>
+        </w:tc>
+      </w:tr>
+      <w:tr>
+        <w:tc>
+          <w:tcPr>
+            <w:tcW w:w="1148" w:type="pct"/>
+          </w:tcPr>
+          <w:p>
+            <w:pPr>
+              <w:ind w:firstLine="0"/>
+              <w:jc w:val="center"/>
+            </w:pPr>
+            <w:r>
+              <w:t>delimiter</w:t>
+            </w:r>
+          </w:p>
+        </w:tc>
+        <w:tc>
+          <w:tcPr>
+            <w:tcW w:w="802" w:type="pct"/>
+          </w:tcPr>
+          <w:p>
+            <w:pPr>
+              <w:ind w:firstLine="0"/>
+              <w:jc w:val="center"/>
+            </w:pPr>
+            <w:r>
+              <w:t>,</w:t>
+            </w:r>
+          </w:p>
+        </w:tc>
+        <w:tc>
+          <w:tcPr>
+            <w:tcW w:w="3050" w:type="pct"/>
+          </w:tcPr>
+          <w:p>
+            <w:pPr>
+              <w:ind w:firstLine="0"/>
+              <w:jc w:val="left"/>
+            </w:pPr>
+            <w:r>
+              <w:t>The delimiter to separate string to a list to get data value</w:t>
+            </w:r>
+          </w:p>
+        </w:tc>
+      </w:tr>
+      <w:tr>
+        <w:tc>
+          <w:tcPr>
+            <w:tcW w:w="1148" w:type="pct"/>
+          </w:tcPr>
+          <w:p>
+            <w:pPr>
+              <w:ind w:firstLine="0"/>
+              <w:jc w:val="center"/>
+            </w:pPr>
+            <w:r>
+              <w:t>index</w:t>
+            </w:r>
+          </w:p>
+        </w:tc>
+        <w:tc>
+          <w:tcPr>
+            <w:tcW w:w="802" w:type="pct"/>
+          </w:tcPr>
+          <w:p>
+            <w:pPr>
+              <w:ind w:firstLine="0"/>
+              <w:jc w:val="center"/>
+            </w:pPr>
+            <w:r>
+              <w:t>0</w:t>
+            </w:r>
+          </w:p>
+        </w:tc>
+        <w:tc>
+          <w:tcPr>
+            <w:tcW w:w="3050" w:type="pct"/>
+          </w:tcPr>
+          <w:p>
+            <w:pPr>
+              <w:ind w:firstLine="0"/>
+              <w:jc w:val="left"/>
+            </w:pPr>
+            <w:r>
+              <w:t>The index of data value in a list converted from a string by the set delimiter</w:t>
+            </w:r>
+          </w:p>
+        </w:tc>
+      </w:tr>
+    </w:tbl>
+    <w:p>
+      <w:pPr>
+        <w:jc w:val="left"/>
+      </w:pPr>
+      <w:r>
+        <w:lastRenderedPageBreak/>
+        <w:t xml:space="preserve">The second part is for variables and commands. </w:t>
+      </w:r>
+      <w:r>
+        <w:t xml:space="preserve">The logger </w:t>
+      </w:r>
+      <w:r>
+        <w:t>first saves variables to each log as a header (1</w:t>
+      </w:r>
+      <w:r>
+        <w:rPr>
+          <w:vertAlign w:val="superscript"/>
+        </w:rPr>
+        <w:t>st</w:t>
+      </w:r>
+      <w:r>
+        <w:t xml:space="preserve"> row). Secondly, it sends commands to device, queries data and processes it based on the configuration, and then saves the data to each </w:t>
+      </w:r>
+      <w:r>
+        <w:t xml:space="preserve">log </w:t>
+      </w:r>
+      <w:r>
+        <w:t>(after 1</w:t>
+      </w:r>
+      <w:r>
+        <w:rPr>
+          <w:vertAlign w:val="superscript"/>
+        </w:rPr>
+        <w:t>st</w:t>
+      </w:r>
+      <w:r>
+        <w:t xml:space="preserve"> row). The format of log will be:</w:t>
+      </w:r>
     </w:p>
     <w:p>
       <w:pPr>
+        <w:jc w:val="left"/>
+        <w:rPr>
+          <w:b/>
+          <w:bCs/>
+        </w:rPr>
+      </w:pPr>
+      <w:r>
+        <w:rPr>
+          <w:b/>
+          <w:bCs/>
+        </w:rPr>
+        <w:t>Date, Time, variable1, variable2, ….</w:t>
+      </w:r>
+    </w:p>
+    <w:p>
+      <w:pPr>
+        <w:jc w:val="left"/>
+        <w:rPr>
+          <w:b/>
+          <w:bCs/>
+        </w:rPr>
+      </w:pPr>
+      <w:r>
+        <w:rPr>
+          <w:b/>
+          <w:bCs/>
+        </w:rPr>
+        <w:t>202</w:t>
+      </w:r>
+      <w:r>
+        <w:rPr>
+          <w:b/>
+          <w:bCs/>
+        </w:rPr>
+        <w:t>4-06-24, 12.29.05, 067, 033, ….</w:t>
+      </w:r>
+    </w:p>
+    <w:p>
+      <w:pPr>
+        <w:jc w:val="left"/>
+        <w:rPr>
+          <w:b/>
+          <w:bCs/>
+        </w:rPr>
+      </w:pPr>
+      <w:r>
+        <w:rPr>
+          <w:b/>
+          <w:bCs/>
+        </w:rPr>
+        <w:t>2024-06-24, 12.29.</w:t>
+      </w:r>
+      <w:r>
+        <w:rPr>
+          <w:b/>
+          <w:bCs/>
+        </w:rPr>
+        <w:t>1</w:t>
+      </w:r>
+      <w:r>
+        <w:rPr>
+          <w:b/>
+          <w:bCs/>
+        </w:rPr>
+        <w:t>5, 067, 033, ….</w:t>
+      </w:r>
+    </w:p>
+    <w:p>
+      <w:pPr>
+        <w:jc w:val="left"/>
+        <w:rPr>
+          <w:b/>
+          <w:bCs/>
+        </w:rPr>
+      </w:pPr>
+      <w:r>
+        <w:rPr>
+          <w:b/>
+          <w:bCs/>
+        </w:rPr>
+        <w:t>….</w:t>
+      </w:r>
+    </w:p>
+    <w:p>
+      <w:pPr>
+        <w:jc w:val="left"/>
+      </w:pPr>
+      <w:r>
+        <w:t xml:space="preserve">In each variable-command line, you can also add some </w:t>
+      </w:r>
+      <w:r>
+        <w:t xml:space="preserve">optional </w:t>
+      </w:r>
+      <w:r>
+        <w:t>arguments. Please be notified that any arguments that you add have effects on pyB12monitor only and won’t affect the behavior of the pyB12logger. These arguments are separated using ‘, ’ (a comma and a space). The available arguments are shown below.</w:t>
+      </w:r>
+    </w:p>
+    <w:tbl>
+      <w:tblPr>
+        <w:tblStyle w:val="TableGrid"/>
+        <w:tblW w:w="6049" w:type="pct"/>
+        <w:tblInd w:w="-545" w:type="dxa"/>
+        <w:tblLayout w:type="fixed"/>
+        <w:tblLook w:val="04A0" w:firstRow="1" w:lastRow="0" w:firstColumn="1" w:lastColumn="0" w:noHBand="0" w:noVBand="1"/>
+      </w:tblPr>
+      <w:tblGrid>
+        <w:gridCol w:w="1441"/>
+        <w:gridCol w:w="6392"/>
+        <w:gridCol w:w="2608"/>
+      </w:tblGrid>
+      <w:tr>
+        <w:tc>
+          <w:tcPr>
+            <w:tcW w:w="690" w:type="pct"/>
+          </w:tcPr>
+          <w:p>
+            <w:pPr>
+              <w:ind w:firstLine="0"/>
+              <w:jc w:val="center"/>
+            </w:pPr>
+            <w:r>
+              <w:t>Arguments</w:t>
+            </w:r>
+          </w:p>
+        </w:tc>
+        <w:tc>
+          <w:tcPr>
+            <w:tcW w:w="3061" w:type="pct"/>
+          </w:tcPr>
+          <w:p>
+            <w:pPr>
+              <w:ind w:firstLine="0"/>
+              <w:jc w:val="center"/>
+            </w:pPr>
+            <w:r>
+              <w:t>Functions</w:t>
+            </w:r>
+          </w:p>
+        </w:tc>
+        <w:tc>
+          <w:tcPr>
+            <w:tcW w:w="1249" w:type="pct"/>
+          </w:tcPr>
+          <w:p>
+            <w:pPr>
+              <w:ind w:firstLine="0"/>
+              <w:jc w:val="center"/>
+            </w:pPr>
+            <w:r>
+              <w:t>Example</w:t>
+            </w:r>
+          </w:p>
+        </w:tc>
+      </w:tr>
+      <w:tr>
+        <w:tc>
+          <w:tcPr>
+            <w:tcW w:w="690" w:type="pct"/>
+          </w:tcPr>
+          <w:p>
+            <w:pPr>
+              <w:ind w:firstLine="0"/>
+              <w:jc w:val="center"/>
+            </w:pPr>
+            <w:r>
+              <w:t>alias</w:t>
+            </w:r>
+          </w:p>
+        </w:tc>
+        <w:tc>
+          <w:tcPr>
+            <w:tcW w:w="3061" w:type="pct"/>
+          </w:tcPr>
+          <w:p>
+            <w:pPr>
+              <w:ind w:firstLine="0"/>
+              <w:jc w:val="left"/>
+            </w:pPr>
+            <w:r>
+              <w:t>Change the displayed name in monitor</w:t>
+            </w:r>
+            <w:r>
+              <w:t>. Space is allowed.</w:t>
+            </w:r>
+          </w:p>
+        </w:tc>
+        <w:tc>
+          <w:tcPr>
+            <w:tcW w:w="1249" w:type="pct"/>
+          </w:tcPr>
+          <w:p>
+            <w:pPr>
+              <w:ind w:firstLine="0"/>
+              <w:jc w:val="left"/>
+            </w:pPr>
+            <w:r>
+              <w:t>alias = He Pressure</w:t>
+            </w:r>
+          </w:p>
+        </w:tc>
+      </w:tr>
+      <w:tr>
+        <w:tc>
+          <w:tcPr>
+            <w:tcW w:w="690" w:type="pct"/>
+          </w:tcPr>
+          <w:p>
+            <w:pPr>
+              <w:ind w:firstLine="0"/>
+              <w:jc w:val="center"/>
+            </w:pPr>
+            <w:r>
+              <w:t>min</w:t>
+            </w:r>
+          </w:p>
+        </w:tc>
+        <w:tc>
+          <w:tcPr>
+            <w:tcW w:w="3061" w:type="pct"/>
+          </w:tcPr>
+          <w:p>
+            <w:pPr>
+              <w:ind w:firstLine="0"/>
+              <w:jc w:val="left"/>
+            </w:pPr>
+            <w:r>
+              <w:t>If a read value is lower than min, the monitor will show a warning message</w:t>
+            </w:r>
+          </w:p>
+        </w:tc>
+        <w:tc>
+          <w:tcPr>
+            <w:tcW w:w="1249" w:type="pct"/>
+          </w:tcPr>
+          <w:p>
+            <w:pPr>
+              <w:ind w:firstLine="0"/>
+              <w:jc w:val="left"/>
+            </w:pPr>
+            <w:r>
+              <w:t>min = 10</w:t>
+            </w:r>
+          </w:p>
+        </w:tc>
+      </w:tr>
+      <w:tr>
+        <w:tc>
+          <w:tcPr>
+            <w:tcW w:w="690" w:type="pct"/>
+          </w:tcPr>
+          <w:p>
+            <w:pPr>
+              <w:ind w:firstLine="0"/>
+              <w:jc w:val="center"/>
+            </w:pPr>
+            <w:r>
+              <w:t>max</w:t>
+            </w:r>
+          </w:p>
+        </w:tc>
+        <w:tc>
+          <w:tcPr>
+            <w:tcW w:w="3061" w:type="pct"/>
+          </w:tcPr>
+          <w:p>
+            <w:pPr>
+              <w:ind w:firstLine="0"/>
+              <w:jc w:val="left"/>
+            </w:pPr>
+            <w:r>
+              <w:t xml:space="preserve">If </w:t>
+            </w:r>
+            <w:r>
+              <w:t xml:space="preserve">a </w:t>
+            </w:r>
+            <w:r>
+              <w:t xml:space="preserve">read value is </w:t>
+            </w:r>
+            <w:r>
+              <w:t>higher</w:t>
+            </w:r>
+            <w:r>
+              <w:t xml:space="preserve"> than m</w:t>
+            </w:r>
+            <w:r>
+              <w:t>ax</w:t>
+            </w:r>
+            <w:r>
+              <w:t>, the monitor will show a warning message</w:t>
+            </w:r>
+          </w:p>
+        </w:tc>
+        <w:tc>
+          <w:tcPr>
+            <w:tcW w:w="1249" w:type="pct"/>
+          </w:tcPr>
+          <w:p>
+            <w:pPr>
+              <w:ind w:firstLine="0"/>
+              <w:jc w:val="left"/>
+            </w:pPr>
+            <w:r>
+              <w:t>max = 25</w:t>
+            </w:r>
+          </w:p>
+        </w:tc>
+      </w:tr>
+      <w:tr>
+        <w:tc>
+          <w:tcPr>
+            <w:tcW w:w="690" w:type="pct"/>
+          </w:tcPr>
+          <w:p>
+            <w:pPr>
+              <w:ind w:firstLine="0"/>
+              <w:jc w:val="center"/>
+            </w:pPr>
+            <w:r>
+              <w:t>static</w:t>
+            </w:r>
+          </w:p>
+        </w:tc>
+        <w:tc>
+          <w:tcPr>
+            <w:tcW w:w="3061" w:type="pct"/>
+          </w:tcPr>
+          <w:p>
+            <w:pPr>
+              <w:ind w:firstLine="0"/>
+              <w:jc w:val="left"/>
+            </w:pPr>
+            <w:r>
+              <w:t xml:space="preserve">If a read value is </w:t>
+            </w:r>
+            <w:r>
+              <w:t>equal to static</w:t>
+            </w:r>
+            <w:r>
+              <w:t>, the monitor will show a warning message</w:t>
+            </w:r>
+          </w:p>
+        </w:tc>
+        <w:tc>
+          <w:tcPr>
+            <w:tcW w:w="1249" w:type="pct"/>
+          </w:tcPr>
+          <w:p>
+            <w:pPr>
+              <w:ind w:firstLine="0"/>
+              <w:jc w:val="left"/>
+            </w:pPr>
+            <w:r>
+              <w:t>static = 17</w:t>
+            </w:r>
+          </w:p>
+        </w:tc>
+      </w:tr>
+      <w:tr>
+        <w:tc>
+          <w:tcPr>
+            <w:tcW w:w="690" w:type="pct"/>
+          </w:tcPr>
+          <w:p>
+            <w:pPr>
+              <w:ind w:firstLine="0"/>
+              <w:jc w:val="center"/>
+            </w:pPr>
+            <w:r>
+              <w:t>bits</w:t>
+            </w:r>
+          </w:p>
+        </w:tc>
+        <w:tc>
+          <w:tcPr>
+            <w:tcW w:w="3061" w:type="pct"/>
+          </w:tcPr>
+          <w:p>
+            <w:pPr>
+              <w:ind w:firstLine="0"/>
+              <w:jc w:val="left"/>
+            </w:pPr>
+            <w:r>
+              <w:t xml:space="preserve">If it is specified and not equal to 0, </w:t>
+            </w:r>
+            <w:r>
+              <w:t xml:space="preserve">indicators will be added to the monitor with the number of bits. It will also disable the display of the variable and convert read value to 16-bits data. </w:t>
+            </w:r>
+          </w:p>
+        </w:tc>
+        <w:tc>
+          <w:tcPr>
+            <w:tcW w:w="1249" w:type="pct"/>
+          </w:tcPr>
+          <w:p>
+            <w:pPr>
+              <w:ind w:firstLine="0"/>
+              <w:jc w:val="left"/>
+            </w:pPr>
+            <w:r>
+              <w:t>bits = 9</w:t>
+            </w:r>
+          </w:p>
+        </w:tc>
+      </w:tr>
+      <w:tr>
+        <w:tc>
+          <w:tcPr>
+            <w:tcW w:w="690" w:type="pct"/>
+          </w:tcPr>
+          <w:p>
+            <w:pPr>
+              <w:ind w:firstLine="0"/>
+              <w:jc w:val="center"/>
+            </w:pPr>
+            <w:proofErr w:type="spellStart"/>
+            <w:r>
+              <w:t>bit_static</w:t>
+            </w:r>
+            <w:proofErr w:type="spellEnd"/>
+          </w:p>
+        </w:tc>
+        <w:tc>
+          <w:tcPr>
+            <w:tcW w:w="3061" w:type="pct"/>
+          </w:tcPr>
+          <w:p>
+            <w:pPr>
+              <w:ind w:firstLine="0"/>
+              <w:jc w:val="left"/>
+            </w:pPr>
+            <w:r>
+              <w:t xml:space="preserve">if bits is specify and a read value is not equal to </w:t>
+            </w:r>
+            <w:proofErr w:type="spellStart"/>
+            <w:r>
+              <w:t>bit_static</w:t>
+            </w:r>
+            <w:proofErr w:type="spellEnd"/>
+            <w:r>
+              <w:t xml:space="preserve">, </w:t>
+            </w:r>
+            <w:r>
+              <w:t>the monitor will show a warning message</w:t>
+            </w:r>
+          </w:p>
+        </w:tc>
+        <w:tc>
+          <w:tcPr>
+            <w:tcW w:w="1249" w:type="pct"/>
+          </w:tcPr>
+          <w:p>
+            <w:pPr>
+              <w:ind w:firstLine="0"/>
+              <w:jc w:val="left"/>
+            </w:pPr>
+            <w:proofErr w:type="spellStart"/>
+            <w:r>
+              <w:t>bit_static</w:t>
+            </w:r>
+            <w:proofErr w:type="spellEnd"/>
+            <w:r>
+              <w:t xml:space="preserve"> = 301</w:t>
+            </w:r>
+          </w:p>
+        </w:tc>
+      </w:tr>
+      <w:tr>
+        <w:tc>
+          <w:tcPr>
+            <w:tcW w:w="690" w:type="pct"/>
+          </w:tcPr>
+          <w:p>
+            <w:pPr>
+              <w:ind w:firstLine="0"/>
+              <w:jc w:val="center"/>
+            </w:pPr>
+            <w:r>
+              <w:t>indicators</w:t>
+            </w:r>
+          </w:p>
+        </w:tc>
+        <w:tc>
+          <w:tcPr>
+            <w:tcW w:w="3061" w:type="pct"/>
+          </w:tcPr>
+          <w:p>
+            <w:pPr>
+              <w:ind w:firstLine="0"/>
+              <w:jc w:val="left"/>
+            </w:pPr>
+            <w:r>
+              <w:t>The list of indicator names. Please be aware that names must have single quote marks and separated by a comma (no space), and the length of list must be greater than or equal to specified bits.</w:t>
+            </w:r>
+            <w:r>
+              <w:t xml:space="preserve"> If there is a star ‘*’ before a name, it means the read Boolean value will be negated (Logical Not).</w:t>
+            </w:r>
+          </w:p>
+        </w:tc>
+        <w:tc>
+          <w:tcPr>
+            <w:tcW w:w="1249" w:type="pct"/>
+          </w:tcPr>
+          <w:p>
+            <w:pPr>
+              <w:ind w:firstLine="0"/>
+              <w:jc w:val="left"/>
+            </w:pPr>
+            <w:r>
+              <w:t>indicators = [‘status1’,’</w:t>
+            </w:r>
+            <w:r>
+              <w:t>*</w:t>
+            </w:r>
+            <w:r>
+              <w:t>status2’,’</w:t>
+            </w:r>
+            <w:r>
+              <w:t>*</w:t>
+            </w:r>
+            <w:r>
+              <w:t>status3’,….]</w:t>
+            </w:r>
+          </w:p>
+        </w:tc>
+      </w:tr>
+    </w:tbl>
+    <w:p>
+      <w:pPr>
         <w:pStyle w:val="Heading1"/>
         <w:ind w:firstLine="0"/>
       </w:pPr>
       <w:r>
+        <w:lastRenderedPageBreak/>
         <w:t>pyB12</w:t>
       </w:r>
       <w:r>
@@ -744,12 +2063,11 @@
         <w:rPr>
           <w:noProof/>
         </w:rPr>
-        <w:lastRenderedPageBreak/>
         <w:drawing>
-          <wp:inline distT="0" distB="0" distL="0" distR="0" wp14:anchorId="7961C934" wp14:editId="4CBD7795">
-            <wp:extent cx="5486400" cy="4344035"/>
-            <wp:effectExtent l="0" t="0" r="0" b="0"/>
-            <wp:docPr id="537098704" name="Picture 4" descr="A screenshot of a computer&#10;&#10;Description automatically generated"/>
+          <wp:inline distT="0" distB="0" distL="0" distR="0" wp14:anchorId="156F1D1B" wp14:editId="634BC4F4">
+            <wp:extent cx="5478780" cy="4572000"/>
+            <wp:effectExtent l="0" t="0" r="7620" b="0"/>
+            <wp:docPr id="655423773" name="Picture 2"/>
             <wp:cNvGraphicFramePr>
               <a:graphicFrameLocks xmlns:a="http://schemas.openxmlformats.org/drawingml/2006/main" noChangeAspect="1"/>
             </wp:cNvGraphicFramePr>
@@ -757,23 +2075,36 @@
               <a:graphicData uri="http://schemas.openxmlformats.org/drawingml/2006/picture">
                 <pic:pic xmlns:pic="http://schemas.openxmlformats.org/drawingml/2006/picture">
                   <pic:nvPicPr>
-                    <pic:cNvPr id="537098704" name="Picture 4" descr="A screenshot of a computer&#10;&#10;Description automatically generated"/>
-                    <pic:cNvPicPr/>
+                    <pic:cNvPr id="0" name="Picture 2"/>
+                    <pic:cNvPicPr>
+                      <a:picLocks noChangeAspect="1" noChangeArrowheads="1"/>
+                    </pic:cNvPicPr>
                   </pic:nvPicPr>
                   <pic:blipFill>
-                    <a:blip r:embed="rId11"/>
+                    <a:blip r:embed="rId10">
+                      <a:extLst>
+                        <a:ext uri="{28A0092B-C50C-407E-A947-70E740481C1C}">
+                          <a14:useLocalDpi xmlns:a14="http://schemas.microsoft.com/office/drawing/2010/main" val="0"/>
+                        </a:ext>
+                      </a:extLst>
+                    </a:blip>
+                    <a:srcRect/>
                     <a:stretch>
                       <a:fillRect/>
                     </a:stretch>
                   </pic:blipFill>
-                  <pic:spPr>
+                  <pic:spPr bwMode="auto">
                     <a:xfrm>
                       <a:off x="0" y="0"/>
-                      <a:ext cx="5486400" cy="4344035"/>
+                      <a:ext cx="5478780" cy="4572000"/>
                     </a:xfrm>
                     <a:prstGeom prst="rect">
                       <a:avLst/>
                     </a:prstGeom>
+                    <a:noFill/>
+                    <a:ln>
+                      <a:noFill/>
+                    </a:ln>
                   </pic:spPr>
                 </pic:pic>
               </a:graphicData>
@@ -786,6 +2117,113 @@
       <w:pPr>
         <w:ind w:firstLine="0"/>
         <w:jc w:val="left"/>
+        <w:rPr>
+          <w:b/>
+          <w:bCs/>
+        </w:rPr>
+      </w:pPr>
+    </w:p>
+    <w:p>
+      <w:pPr>
+        <w:ind w:firstLine="0"/>
+        <w:jc w:val="left"/>
+        <w:rPr>
+          <w:b/>
+          <w:bCs/>
+        </w:rPr>
+      </w:pPr>
+    </w:p>
+    <w:p>
+      <w:pPr>
+        <w:ind w:firstLine="0"/>
+        <w:jc w:val="left"/>
+      </w:pPr>
+      <w:r>
+        <w:rPr>
+          <w:b/>
+          <w:bCs/>
+        </w:rPr>
+        <w:lastRenderedPageBreak/>
+        <w:t>Warnings</w:t>
+      </w:r>
+      <w:r>
+        <w:t>: showing the warnings of devices based on the given ‘min’, ‘max’ or ‘static’ in configuration file.</w:t>
+      </w:r>
+    </w:p>
+    <w:p>
+      <w:pPr>
+        <w:ind w:firstLine="0"/>
+        <w:jc w:val="left"/>
+      </w:pPr>
+      <w:r>
+        <w:rPr>
+          <w:b/>
+          <w:bCs/>
+        </w:rPr>
+        <w:t>Clears</w:t>
+      </w:r>
+      <w:r>
+        <w:t xml:space="preserve">: clear the warning messages. </w:t>
+      </w:r>
+    </w:p>
+    <w:p>
+      <w:pPr>
+        <w:ind w:firstLine="0"/>
+        <w:jc w:val="left"/>
+      </w:pPr>
+      <w:r>
+        <w:rPr>
+          <w:b/>
+          <w:bCs/>
+        </w:rPr>
+        <w:t>Window Length</w:t>
+      </w:r>
+      <w:r>
+        <w:t>: the number of data points shown in the figure.</w:t>
+      </w:r>
+    </w:p>
+    <w:p>
+      <w:pPr>
+        <w:ind w:firstLine="0"/>
+        <w:jc w:val="left"/>
+      </w:pPr>
+      <w:r>
+        <w:rPr>
+          <w:b/>
+          <w:bCs/>
+        </w:rPr>
+        <w:t>Hidden</w:t>
+      </w:r>
+      <w:r>
+        <w:t xml:space="preserve">: </w:t>
+      </w:r>
+      <w:r>
+        <w:t>Hide the selected items in shown list.</w:t>
+      </w:r>
+    </w:p>
+    <w:p>
+      <w:pPr>
+        <w:ind w:firstLine="0"/>
+        <w:jc w:val="left"/>
+      </w:pPr>
+      <w:r>
+        <w:rPr>
+          <w:b/>
+          <w:bCs/>
+        </w:rPr>
+        <w:t>Shown</w:t>
+      </w:r>
+      <w:r>
+        <w:t xml:space="preserve">: </w:t>
+      </w:r>
+      <w:r>
+        <w:t>Show the selected items in hidden list</w:t>
+      </w:r>
+    </w:p>
+    <w:p>
+      <w:pPr>
+        <w:ind w:firstLine="0"/>
+        <w:jc w:val="left"/>
       </w:pPr>
       <w:r>
         <w:rPr>
@@ -797,85 +2235,8 @@
       <w:r>
         <w:t>: showing the status of devices and logger.</w:t>
       </w:r>
-    </w:p>
-    <w:p>
-      <w:pPr>
-        <w:ind w:firstLine="0"/>
-        <w:jc w:val="left"/>
-      </w:pPr>
-      <w:r>
-        <w:rPr>
-          <w:b/>
-          <w:bCs/>
-        </w:rPr>
-        <w:t>Warnings</w:t>
-      </w:r>
-      <w:r>
-        <w:t>: showing the warnings of devices based on the given ‘min’, ‘max’ or ‘static’ in configuration file.</w:t>
-      </w:r>
-    </w:p>
-    <w:p>
-      <w:pPr>
-        <w:ind w:firstLine="0"/>
-        <w:jc w:val="left"/>
-      </w:pPr>
-      <w:r>
-        <w:rPr>
-          <w:b/>
-          <w:bCs/>
-        </w:rPr>
-        <w:t>Window Length</w:t>
-      </w:r>
-      <w:r>
-        <w:t>: the number of data points shown in the figure.</w:t>
-      </w:r>
-    </w:p>
-    <w:p>
-      <w:pPr>
-        <w:ind w:firstLine="0"/>
-        <w:jc w:val="left"/>
-      </w:pPr>
-      <w:r>
-        <w:rPr>
-          <w:b/>
-          <w:bCs/>
-        </w:rPr>
-        <w:t>Hidden</w:t>
-      </w:r>
-      <w:r>
-        <w:t>: the available items to shown in the figure.</w:t>
-      </w:r>
-    </w:p>
-    <w:p>
-      <w:pPr>
-        <w:ind w:firstLine="0"/>
-        <w:jc w:val="left"/>
-      </w:pPr>
-      <w:r>
-        <w:rPr>
-          <w:b/>
-          <w:bCs/>
-        </w:rPr>
-        <w:t>Shown</w:t>
-      </w:r>
-      <w:r>
-        <w:t>: the items shown in the figure.</w:t>
-      </w:r>
-    </w:p>
-    <w:p>
-      <w:pPr>
-        <w:ind w:firstLine="0"/>
-        <w:jc w:val="left"/>
-      </w:pPr>
-      <w:r>
-        <w:rPr>
-          <w:b/>
-          <w:bCs/>
-        </w:rPr>
-        <w:t>Arrow Buttons</w:t>
-      </w:r>
-      <w:r>
-        <w:t>: show or hide the selected data.</w:t>
+      <w:r>
+        <w:t xml:space="preserve"> Green is ok and Red is warning.</w:t>
       </w:r>
     </w:p>
     <w:p>
@@ -926,10 +2287,10 @@
       </w:r>
     </w:p>
     <w:sectPr>
-      <w:headerReference w:type="default" r:id="rId12"/>
-      <w:footerReference w:type="default" r:id="rId13"/>
-      <w:headerReference w:type="first" r:id="rId14"/>
-      <w:footerReference w:type="first" r:id="rId15"/>
+      <w:headerReference w:type="default" r:id="rId11"/>
+      <w:footerReference w:type="default" r:id="rId12"/>
+      <w:headerReference w:type="first" r:id="rId13"/>
+      <w:footerReference w:type="first" r:id="rId14"/>
       <w:pgSz w:w="12240" w:h="15840"/>
       <w:pgMar w:top="1440" w:right="1800" w:bottom="1440" w:left="1800" w:header="720" w:footer="720" w:gutter="0"/>
       <w:cols w:space="720"/>
@@ -941,7 +2302,7 @@
 </file>
 
 <file path=word/endnotes.xml><?xml version="1.0" encoding="utf-8"?>
-<w:endnotes xmlns:wpc="http://schemas.microsoft.com/office/word/2010/wordprocessingCanvas" xmlns:cx="http://schemas.microsoft.com/office/drawing/2014/chartex" xmlns:cx1="http://schemas.microsoft.com/office/drawing/2015/9/8/chartex" xmlns:cx2="http://schemas.microsoft.com/office/drawing/2015/10/21/chartex" xmlns:cx3="http://schemas.microsoft.com/office/drawing/2016/5/9/chartex" xmlns:cx4="http://schemas.microsoft.com/office/drawing/2016/5/10/chartex" xmlns:cx5="http://schemas.microsoft.com/office/drawing/2016/5/11/chartex" xmlns:cx6="http://schemas.microsoft.com/office/drawing/2016/5/12/chartex" xmlns:cx7="http://schemas.microsoft.com/office/drawing/2016/5/13/chartex" xmlns:cx8="http://schemas.microsoft.com/office/drawing/2016/5/14/chartex" xmlns:mc="http://schemas.openxmlformats.org/markup-compatibility/2006" xmlns:aink="http://schemas.microsoft.com/office/drawing/2016/ink" xmlns:am3d="http://schemas.microsoft.com/office/drawing/2017/model3d" xmlns:o="urn:schemas-microsoft-com:office:office" xmlns:oel="http://schemas.microsoft.com/office/2019/extlst" xmlns:r="http://schemas.openxmlformats.org/officeDocument/2006/relationships" xmlns:m="http://schemas.openxmlformats.org/officeDocument/2006/math" xmlns:v="urn:schemas-microsoft-com:vml" xmlns:wp14="http://schemas.microsoft.com/office/word/2010/wordprocessingDrawing" xmlns:wp="http://schemas.openxmlformats.org/drawingml/2006/wordprocessingDrawing" xmlns:w10="urn:schemas-microsoft-com:office:word" xmlns:w="http://schemas.openxmlformats.org/wordprocessingml/2006/main" xmlns:w14="http://schemas.microsoft.com/office/word/2010/wordml" xmlns:w15="http://schemas.microsoft.com/office/word/2012/wordml" xmlns:w16cex="http://schemas.microsoft.com/office/word/2018/wordml/cex" xmlns:w16cid="http://schemas.microsoft.com/office/word/2016/wordml/cid" xmlns:w16="http://schemas.microsoft.com/office/word/2018/wordml" xmlns:w16sdtdh="http://schemas.microsoft.com/office/word/2020/wordml/sdtdatahash" xmlns:w16se="http://schemas.microsoft.com/office/word/2015/wordml/symex" xmlns:wpg="http://schemas.microsoft.com/office/word/2010/wordprocessingGroup" xmlns:wpi="http://schemas.microsoft.com/office/word/2010/wordprocessingInk" xmlns:wne="http://schemas.microsoft.com/office/word/2006/wordml" xmlns:wps="http://schemas.microsoft.com/office/word/2010/wordprocessingShape" mc:Ignorable="w14 w15 w16se w16cid w16 w16cex w16sdtdh wp14">
+<w:endnotes xmlns:wpc="http://schemas.microsoft.com/office/word/2010/wordprocessingCanvas" xmlns:cx="http://schemas.microsoft.com/office/drawing/2014/chartex" xmlns:cx1="http://schemas.microsoft.com/office/drawing/2015/9/8/chartex" xmlns:cx2="http://schemas.microsoft.com/office/drawing/2015/10/21/chartex" xmlns:cx3="http://schemas.microsoft.com/office/drawing/2016/5/9/chartex" xmlns:cx4="http://schemas.microsoft.com/office/drawing/2016/5/10/chartex" xmlns:cx5="http://schemas.microsoft.com/office/drawing/2016/5/11/chartex" xmlns:cx6="http://schemas.microsoft.com/office/drawing/2016/5/12/chartex" xmlns:cx7="http://schemas.microsoft.com/office/drawing/2016/5/13/chartex" xmlns:cx8="http://schemas.microsoft.com/office/drawing/2016/5/14/chartex" xmlns:mc="http://schemas.openxmlformats.org/markup-compatibility/2006" xmlns:aink="http://schemas.microsoft.com/office/drawing/2016/ink" xmlns:am3d="http://schemas.microsoft.com/office/drawing/2017/model3d" xmlns:o="urn:schemas-microsoft-com:office:office" xmlns:oel="http://schemas.microsoft.com/office/2019/extlst" xmlns:r="http://schemas.openxmlformats.org/officeDocument/2006/relationships" xmlns:m="http://schemas.openxmlformats.org/officeDocument/2006/math" xmlns:v="urn:schemas-microsoft-com:vml" xmlns:wp14="http://schemas.microsoft.com/office/word/2010/wordprocessingDrawing" xmlns:wp="http://schemas.openxmlformats.org/drawingml/2006/wordprocessingDrawing" xmlns:w10="urn:schemas-microsoft-com:office:word" xmlns:w="http://schemas.openxmlformats.org/wordprocessingml/2006/main" xmlns:w14="http://schemas.microsoft.com/office/word/2010/wordml" xmlns:w15="http://schemas.microsoft.com/office/word/2012/wordml" xmlns:w16cex="http://schemas.microsoft.com/office/word/2018/wordml/cex" xmlns:w16cid="http://schemas.microsoft.com/office/word/2016/wordml/cid" xmlns:w16="http://schemas.microsoft.com/office/word/2018/wordml" xmlns:w16du="http://schemas.microsoft.com/office/word/2023/wordml/word16du" xmlns:w16sdtdh="http://schemas.microsoft.com/office/word/2020/wordml/sdtdatahash" xmlns:w16se="http://schemas.microsoft.com/office/word/2015/wordml/symex" xmlns:wpg="http://schemas.microsoft.com/office/word/2010/wordprocessingGroup" xmlns:wpi="http://schemas.microsoft.com/office/word/2010/wordprocessingInk" xmlns:wne="http://schemas.microsoft.com/office/word/2006/wordml" xmlns:wps="http://schemas.microsoft.com/office/word/2010/wordprocessingShape" mc:Ignorable="w14 w15 w16se w16cid w16 w16cex w16sdtdh w16du wp14">
   <w:endnote w:type="separator" w:id="-1">
     <w:p>
       <w:r>
@@ -960,7 +2321,7 @@
 </file>
 
 <file path=word/footer1.xml><?xml version="1.0" encoding="utf-8"?>
-<w:ftr xmlns:wpc="http://schemas.microsoft.com/office/word/2010/wordprocessingCanvas" xmlns:cx="http://schemas.microsoft.com/office/drawing/2014/chartex" xmlns:cx1="http://schemas.microsoft.com/office/drawing/2015/9/8/chartex" xmlns:cx2="http://schemas.microsoft.com/office/drawing/2015/10/21/chartex" xmlns:cx3="http://schemas.microsoft.com/office/drawing/2016/5/9/chartex" xmlns:cx4="http://schemas.microsoft.com/office/drawing/2016/5/10/chartex" xmlns:cx5="http://schemas.microsoft.com/office/drawing/2016/5/11/chartex" xmlns:cx6="http://schemas.microsoft.com/office/drawing/2016/5/12/chartex" xmlns:cx7="http://schemas.microsoft.com/office/drawing/2016/5/13/chartex" xmlns:cx8="http://schemas.microsoft.com/office/drawing/2016/5/14/chartex" xmlns:mc="http://schemas.openxmlformats.org/markup-compatibility/2006" xmlns:aink="http://schemas.microsoft.com/office/drawing/2016/ink" xmlns:am3d="http://schemas.microsoft.com/office/drawing/2017/model3d" xmlns:o="urn:schemas-microsoft-com:office:office" xmlns:oel="http://schemas.microsoft.com/office/2019/extlst" xmlns:r="http://schemas.openxmlformats.org/officeDocument/2006/relationships" xmlns:m="http://schemas.openxmlformats.org/officeDocument/2006/math" xmlns:v="urn:schemas-microsoft-com:vml" xmlns:wp14="http://schemas.microsoft.com/office/word/2010/wordprocessingDrawing" xmlns:wp="http://schemas.openxmlformats.org/drawingml/2006/wordprocessingDrawing" xmlns:w10="urn:schemas-microsoft-com:office:word" xmlns:w="http://schemas.openxmlformats.org/wordprocessingml/2006/main" xmlns:w14="http://schemas.microsoft.com/office/word/2010/wordml" xmlns:w15="http://schemas.microsoft.com/office/word/2012/wordml" xmlns:w16cex="http://schemas.microsoft.com/office/word/2018/wordml/cex" xmlns:w16cid="http://schemas.microsoft.com/office/word/2016/wordml/cid" xmlns:w16="http://schemas.microsoft.com/office/word/2018/wordml" xmlns:w16sdtdh="http://schemas.microsoft.com/office/word/2020/wordml/sdtdatahash" xmlns:w16se="http://schemas.microsoft.com/office/word/2015/wordml/symex" xmlns:wpg="http://schemas.microsoft.com/office/word/2010/wordprocessingGroup" xmlns:wpi="http://schemas.microsoft.com/office/word/2010/wordprocessingInk" xmlns:wne="http://schemas.microsoft.com/office/word/2006/wordml" xmlns:wps="http://schemas.microsoft.com/office/word/2010/wordprocessingShape" mc:Ignorable="w14 w15 w16se w16cid w16 w16cex w16sdtdh wp14">
+<w:ftr xmlns:wpc="http://schemas.microsoft.com/office/word/2010/wordprocessingCanvas" xmlns:cx="http://schemas.microsoft.com/office/drawing/2014/chartex" xmlns:cx1="http://schemas.microsoft.com/office/drawing/2015/9/8/chartex" xmlns:cx2="http://schemas.microsoft.com/office/drawing/2015/10/21/chartex" xmlns:cx3="http://schemas.microsoft.com/office/drawing/2016/5/9/chartex" xmlns:cx4="http://schemas.microsoft.com/office/drawing/2016/5/10/chartex" xmlns:cx5="http://schemas.microsoft.com/office/drawing/2016/5/11/chartex" xmlns:cx6="http://schemas.microsoft.com/office/drawing/2016/5/12/chartex" xmlns:cx7="http://schemas.microsoft.com/office/drawing/2016/5/13/chartex" xmlns:cx8="http://schemas.microsoft.com/office/drawing/2016/5/14/chartex" xmlns:mc="http://schemas.openxmlformats.org/markup-compatibility/2006" xmlns:aink="http://schemas.microsoft.com/office/drawing/2016/ink" xmlns:am3d="http://schemas.microsoft.com/office/drawing/2017/model3d" xmlns:o="urn:schemas-microsoft-com:office:office" xmlns:oel="http://schemas.microsoft.com/office/2019/extlst" xmlns:r="http://schemas.openxmlformats.org/officeDocument/2006/relationships" xmlns:m="http://schemas.openxmlformats.org/officeDocument/2006/math" xmlns:v="urn:schemas-microsoft-com:vml" xmlns:wp14="http://schemas.microsoft.com/office/word/2010/wordprocessingDrawing" xmlns:wp="http://schemas.openxmlformats.org/drawingml/2006/wordprocessingDrawing" xmlns:w10="urn:schemas-microsoft-com:office:word" xmlns:w="http://schemas.openxmlformats.org/wordprocessingml/2006/main" xmlns:w14="http://schemas.microsoft.com/office/word/2010/wordml" xmlns:w15="http://schemas.microsoft.com/office/word/2012/wordml" xmlns:w16cex="http://schemas.microsoft.com/office/word/2018/wordml/cex" xmlns:w16cid="http://schemas.microsoft.com/office/word/2016/wordml/cid" xmlns:w16="http://schemas.microsoft.com/office/word/2018/wordml" xmlns:w16du="http://schemas.microsoft.com/office/word/2023/wordml/word16du" xmlns:w16sdtdh="http://schemas.microsoft.com/office/word/2020/wordml/sdtdatahash" xmlns:w16se="http://schemas.microsoft.com/office/word/2015/wordml/symex" xmlns:wpg="http://schemas.microsoft.com/office/word/2010/wordprocessingGroup" xmlns:wpi="http://schemas.microsoft.com/office/word/2010/wordprocessingInk" xmlns:wne="http://schemas.microsoft.com/office/word/2006/wordml" xmlns:wps="http://schemas.microsoft.com/office/word/2010/wordprocessingShape" mc:Ignorable="w14 w15 w16se w16cid w16 w16cex w16sdtdh w16du wp14">
   <w:tbl>
     <w:tblPr>
       <w:tblStyle w:val="TableGrid"/>
@@ -1183,7 +2544,7 @@
 </file>
 
 <file path=word/footer2.xml><?xml version="1.0" encoding="utf-8"?>
-<w:ftr xmlns:wpc="http://schemas.microsoft.com/office/word/2010/wordprocessingCanvas" xmlns:cx="http://schemas.microsoft.com/office/drawing/2014/chartex" xmlns:cx1="http://schemas.microsoft.com/office/drawing/2015/9/8/chartex" xmlns:cx2="http://schemas.microsoft.com/office/drawing/2015/10/21/chartex" xmlns:cx3="http://schemas.microsoft.com/office/drawing/2016/5/9/chartex" xmlns:cx4="http://schemas.microsoft.com/office/drawing/2016/5/10/chartex" xmlns:cx5="http://schemas.microsoft.com/office/drawing/2016/5/11/chartex" xmlns:cx6="http://schemas.microsoft.com/office/drawing/2016/5/12/chartex" xmlns:cx7="http://schemas.microsoft.com/office/drawing/2016/5/13/chartex" xmlns:cx8="http://schemas.microsoft.com/office/drawing/2016/5/14/chartex" xmlns:mc="http://schemas.openxmlformats.org/markup-compatibility/2006" xmlns:aink="http://schemas.microsoft.com/office/drawing/2016/ink" xmlns:am3d="http://schemas.microsoft.com/office/drawing/2017/model3d" xmlns:o="urn:schemas-microsoft-com:office:office" xmlns:oel="http://schemas.microsoft.com/office/2019/extlst" xmlns:r="http://schemas.openxmlformats.org/officeDocument/2006/relationships" xmlns:m="http://schemas.openxmlformats.org/officeDocument/2006/math" xmlns:v="urn:schemas-microsoft-com:vml" xmlns:wp14="http://schemas.microsoft.com/office/word/2010/wordprocessingDrawing" xmlns:wp="http://schemas.openxmlformats.org/drawingml/2006/wordprocessingDrawing" xmlns:w10="urn:schemas-microsoft-com:office:word" xmlns:w="http://schemas.openxmlformats.org/wordprocessingml/2006/main" xmlns:w14="http://schemas.microsoft.com/office/word/2010/wordml" xmlns:w15="http://schemas.microsoft.com/office/word/2012/wordml" xmlns:w16cex="http://schemas.microsoft.com/office/word/2018/wordml/cex" xmlns:w16cid="http://schemas.microsoft.com/office/word/2016/wordml/cid" xmlns:w16="http://schemas.microsoft.com/office/word/2018/wordml" xmlns:w16sdtdh="http://schemas.microsoft.com/office/word/2020/wordml/sdtdatahash" xmlns:w16se="http://schemas.microsoft.com/office/word/2015/wordml/symex" xmlns:wpg="http://schemas.microsoft.com/office/word/2010/wordprocessingGroup" xmlns:wpi="http://schemas.microsoft.com/office/word/2010/wordprocessingInk" xmlns:wne="http://schemas.microsoft.com/office/word/2006/wordml" xmlns:wps="http://schemas.microsoft.com/office/word/2010/wordprocessingShape" mc:Ignorable="w14 w15 w16se w16cid w16 w16cex w16sdtdh wp14">
+<w:ftr xmlns:wpc="http://schemas.microsoft.com/office/word/2010/wordprocessingCanvas" xmlns:cx="http://schemas.microsoft.com/office/drawing/2014/chartex" xmlns:cx1="http://schemas.microsoft.com/office/drawing/2015/9/8/chartex" xmlns:cx2="http://schemas.microsoft.com/office/drawing/2015/10/21/chartex" xmlns:cx3="http://schemas.microsoft.com/office/drawing/2016/5/9/chartex" xmlns:cx4="http://schemas.microsoft.com/office/drawing/2016/5/10/chartex" xmlns:cx5="http://schemas.microsoft.com/office/drawing/2016/5/11/chartex" xmlns:cx6="http://schemas.microsoft.com/office/drawing/2016/5/12/chartex" xmlns:cx7="http://schemas.microsoft.com/office/drawing/2016/5/13/chartex" xmlns:cx8="http://schemas.microsoft.com/office/drawing/2016/5/14/chartex" xmlns:mc="http://schemas.openxmlformats.org/markup-compatibility/2006" xmlns:aink="http://schemas.microsoft.com/office/drawing/2016/ink" xmlns:am3d="http://schemas.microsoft.com/office/drawing/2017/model3d" xmlns:o="urn:schemas-microsoft-com:office:office" xmlns:oel="http://schemas.microsoft.com/office/2019/extlst" xmlns:r="http://schemas.openxmlformats.org/officeDocument/2006/relationships" xmlns:m="http://schemas.openxmlformats.org/officeDocument/2006/math" xmlns:v="urn:schemas-microsoft-com:vml" xmlns:wp14="http://schemas.microsoft.com/office/word/2010/wordprocessingDrawing" xmlns:wp="http://schemas.openxmlformats.org/drawingml/2006/wordprocessingDrawing" xmlns:w10="urn:schemas-microsoft-com:office:word" xmlns:w="http://schemas.openxmlformats.org/wordprocessingml/2006/main" xmlns:w14="http://schemas.microsoft.com/office/word/2010/wordml" xmlns:w15="http://schemas.microsoft.com/office/word/2012/wordml" xmlns:w16cex="http://schemas.microsoft.com/office/word/2018/wordml/cex" xmlns:w16cid="http://schemas.microsoft.com/office/word/2016/wordml/cid" xmlns:w16="http://schemas.microsoft.com/office/word/2018/wordml" xmlns:w16du="http://schemas.microsoft.com/office/word/2023/wordml/word16du" xmlns:w16sdtdh="http://schemas.microsoft.com/office/word/2020/wordml/sdtdatahash" xmlns:w16se="http://schemas.microsoft.com/office/word/2015/wordml/symex" xmlns:wpg="http://schemas.microsoft.com/office/word/2010/wordprocessingGroup" xmlns:wpi="http://schemas.microsoft.com/office/word/2010/wordprocessingInk" xmlns:wne="http://schemas.microsoft.com/office/word/2006/wordml" xmlns:wps="http://schemas.microsoft.com/office/word/2010/wordprocessingShape" mc:Ignorable="w14 w15 w16se w16cid w16 w16cex w16sdtdh w16du wp14">
   <w:tbl>
     <w:tblPr>
       <w:tblStyle w:val="TableGrid"/>
@@ -1470,7 +2831,7 @@
 </file>
 
 <file path=word/footnotes.xml><?xml version="1.0" encoding="utf-8"?>
-<w:footnotes xmlns:wpc="http://schemas.microsoft.com/office/word/2010/wordprocessingCanvas" xmlns:cx="http://schemas.microsoft.com/office/drawing/2014/chartex" xmlns:cx1="http://schemas.microsoft.com/office/drawing/2015/9/8/chartex" xmlns:cx2="http://schemas.microsoft.com/office/drawing/2015/10/21/chartex" xmlns:cx3="http://schemas.microsoft.com/office/drawing/2016/5/9/chartex" xmlns:cx4="http://schemas.microsoft.com/office/drawing/2016/5/10/chartex" xmlns:cx5="http://schemas.microsoft.com/office/drawing/2016/5/11/chartex" xmlns:cx6="http://schemas.microsoft.com/office/drawing/2016/5/12/chartex" xmlns:cx7="http://schemas.microsoft.com/office/drawing/2016/5/13/chartex" xmlns:cx8="http://schemas.microsoft.com/office/drawing/2016/5/14/chartex" xmlns:mc="http://schemas.openxmlformats.org/markup-compatibility/2006" xmlns:aink="http://schemas.microsoft.com/office/drawing/2016/ink" xmlns:am3d="http://schemas.microsoft.com/office/drawing/2017/model3d" xmlns:o="urn:schemas-microsoft-com:office:office" xmlns:oel="http://schemas.microsoft.com/office/2019/extlst" xmlns:r="http://schemas.openxmlformats.org/officeDocument/2006/relationships" xmlns:m="http://schemas.openxmlformats.org/officeDocument/2006/math" xmlns:v="urn:schemas-microsoft-com:vml" xmlns:wp14="http://schemas.microsoft.com/office/word/2010/wordprocessingDrawing" xmlns:wp="http://schemas.openxmlformats.org/drawingml/2006/wordprocessingDrawing" xmlns:w10="urn:schemas-microsoft-com:office:word" xmlns:w="http://schemas.openxmlformats.org/wordprocessingml/2006/main" xmlns:w14="http://schemas.microsoft.com/office/word/2010/wordml" xmlns:w15="http://schemas.microsoft.com/office/word/2012/wordml" xmlns:w16cex="http://schemas.microsoft.com/office/word/2018/wordml/cex" xmlns:w16cid="http://schemas.microsoft.com/office/word/2016/wordml/cid" xmlns:w16="http://schemas.microsoft.com/office/word/2018/wordml" xmlns:w16sdtdh="http://schemas.microsoft.com/office/word/2020/wordml/sdtdatahash" xmlns:w16se="http://schemas.microsoft.com/office/word/2015/wordml/symex" xmlns:wpg="http://schemas.microsoft.com/office/word/2010/wordprocessingGroup" xmlns:wpi="http://schemas.microsoft.com/office/word/2010/wordprocessingInk" xmlns:wne="http://schemas.microsoft.com/office/word/2006/wordml" xmlns:wps="http://schemas.microsoft.com/office/word/2010/wordprocessingShape" mc:Ignorable="w14 w15 w16se w16cid w16 w16cex w16sdtdh wp14">
+<w:footnotes xmlns:wpc="http://schemas.microsoft.com/office/word/2010/wordprocessingCanvas" xmlns:cx="http://schemas.microsoft.com/office/drawing/2014/chartex" xmlns:cx1="http://schemas.microsoft.com/office/drawing/2015/9/8/chartex" xmlns:cx2="http://schemas.microsoft.com/office/drawing/2015/10/21/chartex" xmlns:cx3="http://schemas.microsoft.com/office/drawing/2016/5/9/chartex" xmlns:cx4="http://schemas.microsoft.com/office/drawing/2016/5/10/chartex" xmlns:cx5="http://schemas.microsoft.com/office/drawing/2016/5/11/chartex" xmlns:cx6="http://schemas.microsoft.com/office/drawing/2016/5/12/chartex" xmlns:cx7="http://schemas.microsoft.com/office/drawing/2016/5/13/chartex" xmlns:cx8="http://schemas.microsoft.com/office/drawing/2016/5/14/chartex" xmlns:mc="http://schemas.openxmlformats.org/markup-compatibility/2006" xmlns:aink="http://schemas.microsoft.com/office/drawing/2016/ink" xmlns:am3d="http://schemas.microsoft.com/office/drawing/2017/model3d" xmlns:o="urn:schemas-microsoft-com:office:office" xmlns:oel="http://schemas.microsoft.com/office/2019/extlst" xmlns:r="http://schemas.openxmlformats.org/officeDocument/2006/relationships" xmlns:m="http://schemas.openxmlformats.org/officeDocument/2006/math" xmlns:v="urn:schemas-microsoft-com:vml" xmlns:wp14="http://schemas.microsoft.com/office/word/2010/wordprocessingDrawing" xmlns:wp="http://schemas.openxmlformats.org/drawingml/2006/wordprocessingDrawing" xmlns:w10="urn:schemas-microsoft-com:office:word" xmlns:w="http://schemas.openxmlformats.org/wordprocessingml/2006/main" xmlns:w14="http://schemas.microsoft.com/office/word/2010/wordml" xmlns:w15="http://schemas.microsoft.com/office/word/2012/wordml" xmlns:w16cex="http://schemas.microsoft.com/office/word/2018/wordml/cex" xmlns:w16cid="http://schemas.microsoft.com/office/word/2016/wordml/cid" xmlns:w16="http://schemas.microsoft.com/office/word/2018/wordml" xmlns:w16du="http://schemas.microsoft.com/office/word/2023/wordml/word16du" xmlns:w16sdtdh="http://schemas.microsoft.com/office/word/2020/wordml/sdtdatahash" xmlns:w16se="http://schemas.microsoft.com/office/word/2015/wordml/symex" xmlns:wpg="http://schemas.microsoft.com/office/word/2010/wordprocessingGroup" xmlns:wpi="http://schemas.microsoft.com/office/word/2010/wordprocessingInk" xmlns:wne="http://schemas.microsoft.com/office/word/2006/wordml" xmlns:wps="http://schemas.microsoft.com/office/word/2010/wordprocessingShape" mc:Ignorable="w14 w15 w16se w16cid w16 w16cex w16sdtdh w16du wp14">
   <w:footnote w:type="separator" w:id="-1">
     <w:p>
       <w:r>
@@ -1489,7 +2850,7 @@
 </file>
 
 <file path=word/header1.xml><?xml version="1.0" encoding="utf-8"?>
-<w:hdr xmlns:wpc="http://schemas.microsoft.com/office/word/2010/wordprocessingCanvas" xmlns:cx="http://schemas.microsoft.com/office/drawing/2014/chartex" xmlns:cx1="http://schemas.microsoft.com/office/drawing/2015/9/8/chartex" xmlns:cx2="http://schemas.microsoft.com/office/drawing/2015/10/21/chartex" xmlns:cx3="http://schemas.microsoft.com/office/drawing/2016/5/9/chartex" xmlns:cx4="http://schemas.microsoft.com/office/drawing/2016/5/10/chartex" xmlns:cx5="http://schemas.microsoft.com/office/drawing/2016/5/11/chartex" xmlns:cx6="http://schemas.microsoft.com/office/drawing/2016/5/12/chartex" xmlns:cx7="http://schemas.microsoft.com/office/drawing/2016/5/13/chartex" xmlns:cx8="http://schemas.microsoft.com/office/drawing/2016/5/14/chartex" xmlns:mc="http://schemas.openxmlformats.org/markup-compatibility/2006" xmlns:aink="http://schemas.microsoft.com/office/drawing/2016/ink" xmlns:am3d="http://schemas.microsoft.com/office/drawing/2017/model3d" xmlns:o="urn:schemas-microsoft-com:office:office" xmlns:oel="http://schemas.microsoft.com/office/2019/extlst" xmlns:r="http://schemas.openxmlformats.org/officeDocument/2006/relationships" xmlns:m="http://schemas.openxmlformats.org/officeDocument/2006/math" xmlns:v="urn:schemas-microsoft-com:vml" xmlns:wp14="http://schemas.microsoft.com/office/word/2010/wordprocessingDrawing" xmlns:wp="http://schemas.openxmlformats.org/drawingml/2006/wordprocessingDrawing" xmlns:w10="urn:schemas-microsoft-com:office:word" xmlns:w="http://schemas.openxmlformats.org/wordprocessingml/2006/main" xmlns:w14="http://schemas.microsoft.com/office/word/2010/wordml" xmlns:w15="http://schemas.microsoft.com/office/word/2012/wordml" xmlns:w16cex="http://schemas.microsoft.com/office/word/2018/wordml/cex" xmlns:w16cid="http://schemas.microsoft.com/office/word/2016/wordml/cid" xmlns:w16="http://schemas.microsoft.com/office/word/2018/wordml" xmlns:w16sdtdh="http://schemas.microsoft.com/office/word/2020/wordml/sdtdatahash" xmlns:w16se="http://schemas.microsoft.com/office/word/2015/wordml/symex" xmlns:wpg="http://schemas.microsoft.com/office/word/2010/wordprocessingGroup" xmlns:wpi="http://schemas.microsoft.com/office/word/2010/wordprocessingInk" xmlns:wne="http://schemas.microsoft.com/office/word/2006/wordml" xmlns:wps="http://schemas.microsoft.com/office/word/2010/wordprocessingShape" mc:Ignorable="w14 w15 w16se w16cid w16 w16cex w16sdtdh wp14">
+<w:hdr xmlns:wpc="http://schemas.microsoft.com/office/word/2010/wordprocessingCanvas" xmlns:cx="http://schemas.microsoft.com/office/drawing/2014/chartex" xmlns:cx1="http://schemas.microsoft.com/office/drawing/2015/9/8/chartex" xmlns:cx2="http://schemas.microsoft.com/office/drawing/2015/10/21/chartex" xmlns:cx3="http://schemas.microsoft.com/office/drawing/2016/5/9/chartex" xmlns:cx4="http://schemas.microsoft.com/office/drawing/2016/5/10/chartex" xmlns:cx5="http://schemas.microsoft.com/office/drawing/2016/5/11/chartex" xmlns:cx6="http://schemas.microsoft.com/office/drawing/2016/5/12/chartex" xmlns:cx7="http://schemas.microsoft.com/office/drawing/2016/5/13/chartex" xmlns:cx8="http://schemas.microsoft.com/office/drawing/2016/5/14/chartex" xmlns:mc="http://schemas.openxmlformats.org/markup-compatibility/2006" xmlns:aink="http://schemas.microsoft.com/office/drawing/2016/ink" xmlns:am3d="http://schemas.microsoft.com/office/drawing/2017/model3d" xmlns:o="urn:schemas-microsoft-com:office:office" xmlns:oel="http://schemas.microsoft.com/office/2019/extlst" xmlns:r="http://schemas.openxmlformats.org/officeDocument/2006/relationships" xmlns:m="http://schemas.openxmlformats.org/officeDocument/2006/math" xmlns:v="urn:schemas-microsoft-com:vml" xmlns:wp14="http://schemas.microsoft.com/office/word/2010/wordprocessingDrawing" xmlns:wp="http://schemas.openxmlformats.org/drawingml/2006/wordprocessingDrawing" xmlns:w10="urn:schemas-microsoft-com:office:word" xmlns:w="http://schemas.openxmlformats.org/wordprocessingml/2006/main" xmlns:w14="http://schemas.microsoft.com/office/word/2010/wordml" xmlns:w15="http://schemas.microsoft.com/office/word/2012/wordml" xmlns:w16cex="http://schemas.microsoft.com/office/word/2018/wordml/cex" xmlns:w16cid="http://schemas.microsoft.com/office/word/2016/wordml/cid" xmlns:w16="http://schemas.microsoft.com/office/word/2018/wordml" xmlns:w16du="http://schemas.microsoft.com/office/word/2023/wordml/word16du" xmlns:w16sdtdh="http://schemas.microsoft.com/office/word/2020/wordml/sdtdatahash" xmlns:w16se="http://schemas.microsoft.com/office/word/2015/wordml/symex" xmlns:wpg="http://schemas.microsoft.com/office/word/2010/wordprocessingGroup" xmlns:wpi="http://schemas.microsoft.com/office/word/2010/wordprocessingInk" xmlns:wne="http://schemas.microsoft.com/office/word/2006/wordml" xmlns:wps="http://schemas.microsoft.com/office/word/2010/wordprocessingShape" mc:Ignorable="w14 w15 w16se w16cid w16 w16cex w16sdtdh w16du wp14">
   <w:p>
     <w:pPr>
       <w:pStyle w:val="Header"/>
@@ -1562,7 +2923,7 @@
 </file>
 
 <file path=word/header2.xml><?xml version="1.0" encoding="utf-8"?>
-<w:hdr xmlns:wpc="http://schemas.microsoft.com/office/word/2010/wordprocessingCanvas" xmlns:cx="http://schemas.microsoft.com/office/drawing/2014/chartex" xmlns:cx1="http://schemas.microsoft.com/office/drawing/2015/9/8/chartex" xmlns:cx2="http://schemas.microsoft.com/office/drawing/2015/10/21/chartex" xmlns:cx3="http://schemas.microsoft.com/office/drawing/2016/5/9/chartex" xmlns:cx4="http://schemas.microsoft.com/office/drawing/2016/5/10/chartex" xmlns:cx5="http://schemas.microsoft.com/office/drawing/2016/5/11/chartex" xmlns:cx6="http://schemas.microsoft.com/office/drawing/2016/5/12/chartex" xmlns:cx7="http://schemas.microsoft.com/office/drawing/2016/5/13/chartex" xmlns:cx8="http://schemas.microsoft.com/office/drawing/2016/5/14/chartex" xmlns:mc="http://schemas.openxmlformats.org/markup-compatibility/2006" xmlns:aink="http://schemas.microsoft.com/office/drawing/2016/ink" xmlns:am3d="http://schemas.microsoft.com/office/drawing/2017/model3d" xmlns:o="urn:schemas-microsoft-com:office:office" xmlns:oel="http://schemas.microsoft.com/office/2019/extlst" xmlns:r="http://schemas.openxmlformats.org/officeDocument/2006/relationships" xmlns:m="http://schemas.openxmlformats.org/officeDocument/2006/math" xmlns:v="urn:schemas-microsoft-com:vml" xmlns:wp14="http://schemas.microsoft.com/office/word/2010/wordprocessingDrawing" xmlns:wp="http://schemas.openxmlformats.org/drawingml/2006/wordprocessingDrawing" xmlns:w10="urn:schemas-microsoft-com:office:word" xmlns:w="http://schemas.openxmlformats.org/wordprocessingml/2006/main" xmlns:w14="http://schemas.microsoft.com/office/word/2010/wordml" xmlns:w15="http://schemas.microsoft.com/office/word/2012/wordml" xmlns:w16cex="http://schemas.microsoft.com/office/word/2018/wordml/cex" xmlns:w16cid="http://schemas.microsoft.com/office/word/2016/wordml/cid" xmlns:w16="http://schemas.microsoft.com/office/word/2018/wordml" xmlns:w16sdtdh="http://schemas.microsoft.com/office/word/2020/wordml/sdtdatahash" xmlns:w16se="http://schemas.microsoft.com/office/word/2015/wordml/symex" xmlns:wpg="http://schemas.microsoft.com/office/word/2010/wordprocessingGroup" xmlns:wpi="http://schemas.microsoft.com/office/word/2010/wordprocessingInk" xmlns:wne="http://schemas.microsoft.com/office/word/2006/wordml" xmlns:wps="http://schemas.microsoft.com/office/word/2010/wordprocessingShape" mc:Ignorable="w14 w15 w16se w16cid w16 w16cex w16sdtdh wp14">
+<w:hdr xmlns:wpc="http://schemas.microsoft.com/office/word/2010/wordprocessingCanvas" xmlns:cx="http://schemas.microsoft.com/office/drawing/2014/chartex" xmlns:cx1="http://schemas.microsoft.com/office/drawing/2015/9/8/chartex" xmlns:cx2="http://schemas.microsoft.com/office/drawing/2015/10/21/chartex" xmlns:cx3="http://schemas.microsoft.com/office/drawing/2016/5/9/chartex" xmlns:cx4="http://schemas.microsoft.com/office/drawing/2016/5/10/chartex" xmlns:cx5="http://schemas.microsoft.com/office/drawing/2016/5/11/chartex" xmlns:cx6="http://schemas.microsoft.com/office/drawing/2016/5/12/chartex" xmlns:cx7="http://schemas.microsoft.com/office/drawing/2016/5/13/chartex" xmlns:cx8="http://schemas.microsoft.com/office/drawing/2016/5/14/chartex" xmlns:mc="http://schemas.openxmlformats.org/markup-compatibility/2006" xmlns:aink="http://schemas.microsoft.com/office/drawing/2016/ink" xmlns:am3d="http://schemas.microsoft.com/office/drawing/2017/model3d" xmlns:o="urn:schemas-microsoft-com:office:office" xmlns:oel="http://schemas.microsoft.com/office/2019/extlst" xmlns:r="http://schemas.openxmlformats.org/officeDocument/2006/relationships" xmlns:m="http://schemas.openxmlformats.org/officeDocument/2006/math" xmlns:v="urn:schemas-microsoft-com:vml" xmlns:wp14="http://schemas.microsoft.com/office/word/2010/wordprocessingDrawing" xmlns:wp="http://schemas.openxmlformats.org/drawingml/2006/wordprocessingDrawing" xmlns:w10="urn:schemas-microsoft-com:office:word" xmlns:w="http://schemas.openxmlformats.org/wordprocessingml/2006/main" xmlns:w14="http://schemas.microsoft.com/office/word/2010/wordml" xmlns:w15="http://schemas.microsoft.com/office/word/2012/wordml" xmlns:w16cex="http://schemas.microsoft.com/office/word/2018/wordml/cex" xmlns:w16cid="http://schemas.microsoft.com/office/word/2016/wordml/cid" xmlns:w16="http://schemas.microsoft.com/office/word/2018/wordml" xmlns:w16du="http://schemas.microsoft.com/office/word/2023/wordml/word16du" xmlns:w16sdtdh="http://schemas.microsoft.com/office/word/2020/wordml/sdtdatahash" xmlns:w16se="http://schemas.microsoft.com/office/word/2015/wordml/symex" xmlns:wpg="http://schemas.microsoft.com/office/word/2010/wordprocessingGroup" xmlns:wpi="http://schemas.microsoft.com/office/word/2010/wordprocessingInk" xmlns:wne="http://schemas.microsoft.com/office/word/2006/wordml" xmlns:wps="http://schemas.microsoft.com/office/word/2010/wordprocessingShape" mc:Ignorable="w14 w15 w16se w16cid w16 w16cex w16sdtdh w16du wp14">
   <w:tbl>
     <w:tblPr>
       <w:tblStyle w:val="TableGrid"/>
@@ -1682,7 +3043,7 @@
 </file>
 
 <file path=word/numbering.xml><?xml version="1.0" encoding="utf-8"?>
-<w:numbering xmlns:wpc="http://schemas.microsoft.com/office/word/2010/wordprocessingCanvas" xmlns:cx="http://schemas.microsoft.com/office/drawing/2014/chartex" xmlns:cx1="http://schemas.microsoft.com/office/drawing/2015/9/8/chartex" xmlns:cx2="http://schemas.microsoft.com/office/drawing/2015/10/21/chartex" xmlns:cx3="http://schemas.microsoft.com/office/drawing/2016/5/9/chartex" xmlns:cx4="http://schemas.microsoft.com/office/drawing/2016/5/10/chartex" xmlns:cx5="http://schemas.microsoft.com/office/drawing/2016/5/11/chartex" xmlns:cx6="http://schemas.microsoft.com/office/drawing/2016/5/12/chartex" xmlns:cx7="http://schemas.microsoft.com/office/drawing/2016/5/13/chartex" xmlns:cx8="http://schemas.microsoft.com/office/drawing/2016/5/14/chartex" xmlns:mc="http://schemas.openxmlformats.org/markup-compatibility/2006" xmlns:aink="http://schemas.microsoft.com/office/drawing/2016/ink" xmlns:am3d="http://schemas.microsoft.com/office/drawing/2017/model3d" xmlns:o="urn:schemas-microsoft-com:office:office" xmlns:oel="http://schemas.microsoft.com/office/2019/extlst" xmlns:r="http://schemas.openxmlformats.org/officeDocument/2006/relationships" xmlns:m="http://schemas.openxmlformats.org/officeDocument/2006/math" xmlns:v="urn:schemas-microsoft-com:vml" xmlns:wp14="http://schemas.microsoft.com/office/word/2010/wordprocessingDrawing" xmlns:wp="http://schemas.openxmlformats.org/drawingml/2006/wordprocessingDrawing" xmlns:w10="urn:schemas-microsoft-com:office:word" xmlns:w="http://schemas.openxmlformats.org/wordprocessingml/2006/main" xmlns:w14="http://schemas.microsoft.com/office/word/2010/wordml" xmlns:w15="http://schemas.microsoft.com/office/word/2012/wordml" xmlns:w16cex="http://schemas.microsoft.com/office/word/2018/wordml/cex" xmlns:w16cid="http://schemas.microsoft.com/office/word/2016/wordml/cid" xmlns:w16="http://schemas.microsoft.com/office/word/2018/wordml" xmlns:w16sdtdh="http://schemas.microsoft.com/office/word/2020/wordml/sdtdatahash" xmlns:w16se="http://schemas.microsoft.com/office/word/2015/wordml/symex" xmlns:wpg="http://schemas.microsoft.com/office/word/2010/wordprocessingGroup" xmlns:wpi="http://schemas.microsoft.com/office/word/2010/wordprocessingInk" xmlns:wne="http://schemas.microsoft.com/office/word/2006/wordml" xmlns:wps="http://schemas.microsoft.com/office/word/2010/wordprocessingShape" mc:Ignorable="w14 w15 w16se w16cid w16 w16cex w16sdtdh wp14">
+<w:numbering xmlns:wpc="http://schemas.microsoft.com/office/word/2010/wordprocessingCanvas" xmlns:cx="http://schemas.microsoft.com/office/drawing/2014/chartex" xmlns:cx1="http://schemas.microsoft.com/office/drawing/2015/9/8/chartex" xmlns:cx2="http://schemas.microsoft.com/office/drawing/2015/10/21/chartex" xmlns:cx3="http://schemas.microsoft.com/office/drawing/2016/5/9/chartex" xmlns:cx4="http://schemas.microsoft.com/office/drawing/2016/5/10/chartex" xmlns:cx5="http://schemas.microsoft.com/office/drawing/2016/5/11/chartex" xmlns:cx6="http://schemas.microsoft.com/office/drawing/2016/5/12/chartex" xmlns:cx7="http://schemas.microsoft.com/office/drawing/2016/5/13/chartex" xmlns:cx8="http://schemas.microsoft.com/office/drawing/2016/5/14/chartex" xmlns:mc="http://schemas.openxmlformats.org/markup-compatibility/2006" xmlns:aink="http://schemas.microsoft.com/office/drawing/2016/ink" xmlns:am3d="http://schemas.microsoft.com/office/drawing/2017/model3d" xmlns:o="urn:schemas-microsoft-com:office:office" xmlns:oel="http://schemas.microsoft.com/office/2019/extlst" xmlns:r="http://schemas.openxmlformats.org/officeDocument/2006/relationships" xmlns:m="http://schemas.openxmlformats.org/officeDocument/2006/math" xmlns:v="urn:schemas-microsoft-com:vml" xmlns:wp14="http://schemas.microsoft.com/office/word/2010/wordprocessingDrawing" xmlns:wp="http://schemas.openxmlformats.org/drawingml/2006/wordprocessingDrawing" xmlns:w10="urn:schemas-microsoft-com:office:word" xmlns:w="http://schemas.openxmlformats.org/wordprocessingml/2006/main" xmlns:w14="http://schemas.microsoft.com/office/word/2010/wordml" xmlns:w15="http://schemas.microsoft.com/office/word/2012/wordml" xmlns:w16cex="http://schemas.microsoft.com/office/word/2018/wordml/cex" xmlns:w16cid="http://schemas.microsoft.com/office/word/2016/wordml/cid" xmlns:w16="http://schemas.microsoft.com/office/word/2018/wordml" xmlns:w16du="http://schemas.microsoft.com/office/word/2023/wordml/word16du" xmlns:w16sdtdh="http://schemas.microsoft.com/office/word/2020/wordml/sdtdatahash" xmlns:w16se="http://schemas.microsoft.com/office/word/2015/wordml/symex" xmlns:wpg="http://schemas.microsoft.com/office/word/2010/wordprocessingGroup" xmlns:wpi="http://schemas.microsoft.com/office/word/2010/wordprocessingInk" xmlns:wne="http://schemas.microsoft.com/office/word/2006/wordml" xmlns:wps="http://schemas.microsoft.com/office/word/2010/wordprocessingShape" mc:Ignorable="w14 w15 w16se w16cid w16 w16cex w16sdtdh w16du wp14">
   <w:abstractNum w:abstractNumId="0" w15:restartNumberingAfterBreak="0">
     <w:nsid w:val="FFFFFF1D"/>
     <w:multiLevelType w:val="hybridMultilevel"/>
@@ -2986,6 +4347,95 @@
     </w:lvl>
   </w:abstractNum>
   <w:abstractNum w:abstractNumId="20" w15:restartNumberingAfterBreak="0">
+    <w:nsid w:val="6A285255"/>
+    <w:multiLevelType w:val="hybridMultilevel"/>
+    <w:tmpl w:val="CC30E122"/>
+    <w:lvl w:ilvl="0" w:tplc="0E5EA574">
+      <w:start w:val="1"/>
+      <w:numFmt w:val="decimal"/>
+      <w:lvlText w:val="%1."/>
+      <w:lvlJc w:val="left"/>
+      <w:pPr>
+        <w:ind w:left="648" w:hanging="360"/>
+      </w:pPr>
+      <w:rPr>
+        <w:rFonts w:hint="default"/>
+      </w:rPr>
+    </w:lvl>
+    <w:lvl w:ilvl="1" w:tplc="04090019" w:tentative="1">
+      <w:start w:val="1"/>
+      <w:numFmt w:val="lowerLetter"/>
+      <w:lvlText w:val="%2."/>
+      <w:lvlJc w:val="left"/>
+      <w:pPr>
+        <w:ind w:left="1368" w:hanging="360"/>
+      </w:pPr>
+    </w:lvl>
+    <w:lvl w:ilvl="2" w:tplc="0409001B" w:tentative="1">
+      <w:start w:val="1"/>
+      <w:numFmt w:val="lowerRoman"/>
+      <w:lvlText w:val="%3."/>
+      <w:lvlJc w:val="right"/>
+      <w:pPr>
+        <w:ind w:left="2088" w:hanging="180"/>
+      </w:pPr>
+    </w:lvl>
+    <w:lvl w:ilvl="3" w:tplc="0409000F" w:tentative="1">
+      <w:start w:val="1"/>
+      <w:numFmt w:val="decimal"/>
+      <w:lvlText w:val="%4."/>
+      <w:lvlJc w:val="left"/>
+      <w:pPr>
+        <w:ind w:left="2808" w:hanging="360"/>
+      </w:pPr>
+    </w:lvl>
+    <w:lvl w:ilvl="4" w:tplc="04090019" w:tentative="1">
+      <w:start w:val="1"/>
+      <w:numFmt w:val="lowerLetter"/>
+      <w:lvlText w:val="%5."/>
+      <w:lvlJc w:val="left"/>
+      <w:pPr>
+        <w:ind w:left="3528" w:hanging="360"/>
+      </w:pPr>
+    </w:lvl>
+    <w:lvl w:ilvl="5" w:tplc="0409001B" w:tentative="1">
+      <w:start w:val="1"/>
+      <w:numFmt w:val="lowerRoman"/>
+      <w:lvlText w:val="%6."/>
+      <w:lvlJc w:val="right"/>
+      <w:pPr>
+        <w:ind w:left="4248" w:hanging="180"/>
+      </w:pPr>
+    </w:lvl>
+    <w:lvl w:ilvl="6" w:tplc="0409000F" w:tentative="1">
+      <w:start w:val="1"/>
+      <w:numFmt w:val="decimal"/>
+      <w:lvlText w:val="%7."/>
+      <w:lvlJc w:val="left"/>
+      <w:pPr>
+        <w:ind w:left="4968" w:hanging="360"/>
+      </w:pPr>
+    </w:lvl>
+    <w:lvl w:ilvl="7" w:tplc="04090019" w:tentative="1">
+      <w:start w:val="1"/>
+      <w:numFmt w:val="lowerLetter"/>
+      <w:lvlText w:val="%8."/>
+      <w:lvlJc w:val="left"/>
+      <w:pPr>
+        <w:ind w:left="5688" w:hanging="360"/>
+      </w:pPr>
+    </w:lvl>
+    <w:lvl w:ilvl="8" w:tplc="0409001B" w:tentative="1">
+      <w:start w:val="1"/>
+      <w:numFmt w:val="lowerRoman"/>
+      <w:lvlText w:val="%9."/>
+      <w:lvlJc w:val="right"/>
+      <w:pPr>
+        <w:ind w:left="6408" w:hanging="180"/>
+      </w:pPr>
+    </w:lvl>
+  </w:abstractNum>
+  <w:abstractNum w:abstractNumId="21" w15:restartNumberingAfterBreak="0">
     <w:nsid w:val="723C3C26"/>
     <w:multiLevelType w:val="multilevel"/>
     <w:tmpl w:val="30C43A94"/>
@@ -3098,7 +4548,7 @@
       </w:rPr>
     </w:lvl>
   </w:abstractNum>
-  <w:abstractNum w:abstractNumId="21" w15:restartNumberingAfterBreak="0">
+  <w:abstractNum w:abstractNumId="22" w15:restartNumberingAfterBreak="0">
     <w:nsid w:val="72B2751F"/>
     <w:multiLevelType w:val="hybridMultilevel"/>
     <w:tmpl w:val="DE88B224"/>
@@ -3216,7 +4666,7 @@
       </w:pPr>
     </w:lvl>
   </w:abstractNum>
-  <w:abstractNum w:abstractNumId="22" w15:restartNumberingAfterBreak="0">
+  <w:abstractNum w:abstractNumId="23" w15:restartNumberingAfterBreak="0">
     <w:nsid w:val="731403F3"/>
     <w:multiLevelType w:val="hybridMultilevel"/>
     <w:tmpl w:val="4F609322"/>
@@ -3329,7 +4779,7 @@
       </w:rPr>
     </w:lvl>
   </w:abstractNum>
-  <w:abstractNum w:abstractNumId="23" w15:restartNumberingAfterBreak="0">
+  <w:abstractNum w:abstractNumId="24" w15:restartNumberingAfterBreak="0">
     <w:nsid w:val="770003FC"/>
     <w:multiLevelType w:val="multilevel"/>
     <w:tmpl w:val="E1725DEC"/>
@@ -3446,7 +4896,7 @@
     <w:abstractNumId w:val="11"/>
   </w:num>
   <w:num w:numId="2" w16cid:durableId="1842965275">
-    <w:abstractNumId w:val="21"/>
+    <w:abstractNumId w:val="22"/>
   </w:num>
   <w:num w:numId="3" w16cid:durableId="1571579034">
     <w:abstractNumId w:val="16"/>
@@ -3464,10 +4914,10 @@
     <w:abstractNumId w:val="15"/>
   </w:num>
   <w:num w:numId="8" w16cid:durableId="1906260928">
-    <w:abstractNumId w:val="23"/>
+    <w:abstractNumId w:val="24"/>
   </w:num>
   <w:num w:numId="9" w16cid:durableId="305091125">
-    <w:abstractNumId w:val="22"/>
+    <w:abstractNumId w:val="23"/>
   </w:num>
   <w:num w:numId="10" w16cid:durableId="825435906">
     <w:abstractNumId w:val="0"/>
@@ -3503,7 +4953,7 @@
     <w:abstractNumId w:val="10"/>
   </w:num>
   <w:num w:numId="21" w16cid:durableId="1342050090">
-    <w:abstractNumId w:val="20"/>
+    <w:abstractNumId w:val="21"/>
   </w:num>
   <w:num w:numId="22" w16cid:durableId="647057469">
     <w:abstractNumId w:val="18"/>
@@ -3544,11 +4994,14 @@
       <w:startOverride w:val="1"/>
     </w:lvlOverride>
   </w:num>
+  <w:num w:numId="26" w16cid:durableId="1881742460">
+    <w:abstractNumId w:val="20"/>
+  </w:num>
 </w:numbering>
 </file>
 
 <file path=word/styles.xml><?xml version="1.0" encoding="utf-8"?>
-<w:styles xmlns:mc="http://schemas.openxmlformats.org/markup-compatibility/2006" xmlns:r="http://schemas.openxmlformats.org/officeDocument/2006/relationships" xmlns:w="http://schemas.openxmlformats.org/wordprocessingml/2006/main" xmlns:w14="http://schemas.microsoft.com/office/word/2010/wordml" xmlns:w15="http://schemas.microsoft.com/office/word/2012/wordml" xmlns:w16cex="http://schemas.microsoft.com/office/word/2018/wordml/cex" xmlns:w16cid="http://schemas.microsoft.com/office/word/2016/wordml/cid" xmlns:w16="http://schemas.microsoft.com/office/word/2018/wordml" xmlns:w16sdtdh="http://schemas.microsoft.com/office/word/2020/wordml/sdtdatahash" xmlns:w16se="http://schemas.microsoft.com/office/word/2015/wordml/symex" mc:Ignorable="w14 w15 w16se w16cid w16 w16cex w16sdtdh">
+<w:styles xmlns:mc="http://schemas.openxmlformats.org/markup-compatibility/2006" xmlns:r="http://schemas.openxmlformats.org/officeDocument/2006/relationships" xmlns:w="http://schemas.openxmlformats.org/wordprocessingml/2006/main" xmlns:w14="http://schemas.microsoft.com/office/word/2010/wordml" xmlns:w15="http://schemas.microsoft.com/office/word/2012/wordml" xmlns:w16cex="http://schemas.microsoft.com/office/word/2018/wordml/cex" xmlns:w16cid="http://schemas.microsoft.com/office/word/2016/wordml/cid" xmlns:w16="http://schemas.microsoft.com/office/word/2018/wordml" xmlns:w16du="http://schemas.microsoft.com/office/word/2023/wordml/word16du" xmlns:w16sdtdh="http://schemas.microsoft.com/office/word/2020/wordml/sdtdatahash" xmlns:w16se="http://schemas.microsoft.com/office/word/2015/wordml/symex" mc:Ignorable="w14 w15 w16se w16cid w16 w16cex w16sdtdh w16du">
   <w:docDefaults>
     <w:rPrDefault>
       <w:rPr>

</xml_diff>